<commit_message>
feat: finaliza relatório final
</commit_message>
<xml_diff>
--- a/relatorio_final/relatorio_final.docx
+++ b/relatorio_final/relatorio_final.docx
@@ -361,42 +361,6 @@
     </w:p>
     <w:p>
       <w:pPr>
-        <w:jc w:val="center"/>
-      </w:pPr>
-      <w:r>
-        <w:lastRenderedPageBreak/>
-        <w:t>sumário</w:t>
-      </w:r>
-    </w:p>
-    <w:p/>
-    <w:p/>
-    <w:p/>
-    <w:p/>
-    <w:p/>
-    <w:p/>
-    <w:p/>
-    <w:p/>
-    <w:p/>
-    <w:p/>
-    <w:p/>
-    <w:p/>
-    <w:p/>
-    <w:p/>
-    <w:p/>
-    <w:p/>
-    <w:p/>
-    <w:p/>
-    <w:p/>
-    <w:p/>
-    <w:p/>
-    <w:p/>
-    <w:p/>
-    <w:p/>
-    <w:p/>
-    <w:p/>
-    <w:p/>
-    <w:p>
-      <w:pPr>
         <w:rPr>
           <w:rFonts w:ascii="Arial" w:hAnsi="Arial" w:cs="Arial"/>
           <w:b/>
@@ -447,19 +411,25 @@
         <w:rPr>
           <w:rFonts w:ascii="Arial" w:hAnsi="Arial" w:cs="Arial"/>
         </w:rPr>
-        <w:t>F</w:t>
-      </w:r>
-      <w:r>
-        <w:rPr>
-          <w:rFonts w:ascii="Arial" w:hAnsi="Arial" w:cs="Arial"/>
-        </w:rPr>
-        <w:t xml:space="preserve">oi possível configurar estas placas </w:t>
-      </w:r>
-      <w:r>
-        <w:rPr>
-          <w:rFonts w:ascii="Arial" w:hAnsi="Arial" w:cs="Arial"/>
-        </w:rPr>
-        <w:t xml:space="preserve">para que os estudantes de </w:t>
+        <w:t>Ao final, f</w:t>
+      </w:r>
+      <w:r>
+        <w:rPr>
+          <w:rFonts w:ascii="Arial" w:hAnsi="Arial" w:cs="Arial"/>
+        </w:rPr>
+        <w:t>oi possível configurar estas placas</w:t>
+      </w:r>
+      <w:r>
+        <w:rPr>
+          <w:rFonts w:ascii="Arial" w:hAnsi="Arial" w:cs="Arial"/>
+        </w:rPr>
+        <w:t xml:space="preserve">, permitindo </w:t>
+      </w:r>
+      <w:r>
+        <w:rPr>
+          <w:rFonts w:ascii="Arial" w:hAnsi="Arial" w:cs="Arial"/>
+        </w:rPr>
+        <w:t xml:space="preserve">que os estudantes de </w:t>
       </w:r>
       <w:r>
         <w:rPr>
@@ -500,9 +470,118 @@
           <w:sz w:val="28"/>
           <w:szCs w:val="28"/>
         </w:rPr>
-        <w:t>2</w:t>
-      </w:r>
-      <w:r>
+        <w:t>2) INTRODUÇÃO</w:t>
+      </w:r>
+    </w:p>
+    <w:p>
+      <w:pPr>
+        <w:ind w:firstLine="567"/>
+        <w:jc w:val="both"/>
+        <w:rPr>
+          <w:rFonts w:ascii="Arial" w:hAnsi="Arial" w:cs="Arial"/>
+        </w:rPr>
+      </w:pPr>
+      <w:r>
+        <w:rPr>
+          <w:rFonts w:ascii="Arial" w:hAnsi="Arial" w:cs="Arial"/>
+        </w:rPr>
+        <w:t>A modulação digital é uma técnica que consiste em transmitir dados digitais, isto é, sequências de bits 0 e 1, na forma de sinais elétricos por um meio físico de transmissão, como cabos e ondas de rádio</w:t>
+      </w:r>
+      <w:r>
+        <w:rPr>
+          <w:rFonts w:ascii="Arial" w:hAnsi="Arial" w:cs="Arial"/>
+        </w:rPr>
+        <w:t xml:space="preserve"> </w:t>
+      </w:r>
+      <w:r>
+        <w:rPr>
+          <w:rFonts w:ascii="Arial" w:hAnsi="Arial" w:cs="Arial"/>
+        </w:rPr>
+        <w:t>(MATHIAS; PAVÃO, 2026)</w:t>
+      </w:r>
+      <w:r>
+        <w:rPr>
+          <w:rFonts w:ascii="Arial" w:hAnsi="Arial" w:cs="Arial"/>
+        </w:rPr>
+        <w:t>.</w:t>
+      </w:r>
+    </w:p>
+    <w:p>
+      <w:pPr>
+        <w:ind w:firstLine="567"/>
+        <w:jc w:val="both"/>
+        <w:rPr>
+          <w:rFonts w:ascii="Arial" w:hAnsi="Arial" w:cs="Arial"/>
+        </w:rPr>
+      </w:pPr>
+      <w:r>
+        <w:rPr>
+          <w:rFonts w:ascii="Arial" w:hAnsi="Arial" w:cs="Arial"/>
+        </w:rPr>
+        <w:t xml:space="preserve">Visando enriquecer a experiência dos alunos da disciplina de </w:t>
+      </w:r>
+      <w:r>
+        <w:rPr>
+          <w:rFonts w:ascii="Arial" w:hAnsi="Arial" w:cs="Arial"/>
+        </w:rPr>
+        <w:t>Comunicação de Dados</w:t>
+      </w:r>
+      <w:r>
+        <w:rPr>
+          <w:rFonts w:ascii="Arial" w:hAnsi="Arial" w:cs="Arial"/>
+        </w:rPr>
+        <w:t>, o presente projeto teve por objetivo mostrar, da teoria à prática, como funcionam as modulações unipolares NRZ-I e NRZ-L.</w:t>
+      </w:r>
+    </w:p>
+    <w:p>
+      <w:pPr>
+        <w:ind w:firstLine="567"/>
+        <w:jc w:val="both"/>
+        <w:rPr>
+          <w:rFonts w:ascii="Arial" w:hAnsi="Arial" w:cs="Arial"/>
+        </w:rPr>
+      </w:pPr>
+      <w:r>
+        <w:rPr>
+          <w:rFonts w:ascii="Arial" w:hAnsi="Arial" w:cs="Arial"/>
+        </w:rPr>
+        <w:t>Com base na abordagem proposta, buscou-se introduzir os alunos aos conceitos fundamentais destas técnicas de modulação, além de conduzi-los na configuração e programação de circuitos FPGA utilizando a linguagem VHDL, para que pudessem</w:t>
+      </w:r>
+      <w:r>
+        <w:rPr>
+          <w:rFonts w:ascii="Arial" w:hAnsi="Arial" w:cs="Arial"/>
+        </w:rPr>
+        <w:t xml:space="preserve"> simular tais processos, garantindo</w:t>
+      </w:r>
+      <w:r>
+        <w:rPr>
+          <w:rFonts w:ascii="Arial" w:hAnsi="Arial" w:cs="Arial"/>
+        </w:rPr>
+        <w:t xml:space="preserve"> uma visão </w:t>
+      </w:r>
+      <w:r>
+        <w:rPr>
+          <w:rFonts w:ascii="Arial" w:hAnsi="Arial" w:cs="Arial"/>
+        </w:rPr>
+        <w:t>um pouco mais concreta</w:t>
+      </w:r>
+      <w:r>
+        <w:rPr>
+          <w:rFonts w:ascii="Arial" w:hAnsi="Arial" w:cs="Arial"/>
+        </w:rPr>
+        <w:t xml:space="preserve"> sobre o assunto estuado.</w:t>
+      </w:r>
+    </w:p>
+    <w:p>
+      <w:pPr>
+        <w:jc w:val="both"/>
+        <w:rPr>
+          <w:rFonts w:ascii="Arial" w:hAnsi="Arial" w:cs="Arial"/>
+        </w:rPr>
+      </w:pPr>
+    </w:p>
+    <w:p>
+      <w:pPr>
         <w:rPr>
           <w:rFonts w:ascii="Arial" w:hAnsi="Arial" w:cs="Arial"/>
           <w:b/>
@@ -510,8 +589,7 @@
           <w:sz w:val="28"/>
           <w:szCs w:val="28"/>
         </w:rPr>
-        <w:t xml:space="preserve">) </w:t>
-      </w:r>
+      </w:pPr>
       <w:r>
         <w:rPr>
           <w:rFonts w:ascii="Arial" w:hAnsi="Arial" w:cs="Arial"/>
@@ -520,137 +598,7 @@
           <w:sz w:val="28"/>
           <w:szCs w:val="28"/>
         </w:rPr>
-        <w:t>INTRODUÇÃO</w:t>
-      </w:r>
-    </w:p>
-    <w:p>
-      <w:pPr>
-        <w:ind w:firstLine="567"/>
-        <w:jc w:val="both"/>
-        <w:rPr>
-          <w:rFonts w:ascii="Arial" w:hAnsi="Arial" w:cs="Arial"/>
-        </w:rPr>
-      </w:pPr>
-      <w:r>
-        <w:rPr>
-          <w:rFonts w:ascii="Arial" w:hAnsi="Arial" w:cs="Arial"/>
-        </w:rPr>
-        <w:t>A modulação digital é uma técnica que consiste em transmitir dados digitais, isto é, sequências de bits 0 e 1, na forma de sinais elétricos por um meio físico de transmissão, como cabos e ondas de rádio. (artigo maua)</w:t>
-      </w:r>
-    </w:p>
-    <w:p>
-      <w:pPr>
-        <w:ind w:firstLine="567"/>
-        <w:jc w:val="both"/>
-        <w:rPr>
-          <w:rFonts w:ascii="Arial" w:hAnsi="Arial" w:cs="Arial"/>
-        </w:rPr>
-      </w:pPr>
-      <w:r>
-        <w:rPr>
-          <w:rFonts w:ascii="Arial" w:hAnsi="Arial" w:cs="Arial"/>
-        </w:rPr>
-        <w:t xml:space="preserve">Visando enriquecer a experiência dos alunos da disciplina de </w:t>
-      </w:r>
-      <w:r>
-        <w:rPr>
-          <w:rFonts w:ascii="Arial" w:hAnsi="Arial" w:cs="Arial"/>
-        </w:rPr>
-        <w:t>Comunicação de Dados</w:t>
-      </w:r>
-      <w:r>
-        <w:rPr>
-          <w:rFonts w:ascii="Arial" w:hAnsi="Arial" w:cs="Arial"/>
-        </w:rPr>
-        <w:t>, o presente projeto teve por objetivo mostrar, da teoria à prática, como funcionam as modulações unipolares NRZ-I e NRZ-L.</w:t>
-      </w:r>
-    </w:p>
-    <w:p>
-      <w:pPr>
-        <w:ind w:firstLine="567"/>
-        <w:jc w:val="both"/>
-        <w:rPr>
-          <w:rFonts w:ascii="Arial" w:hAnsi="Arial" w:cs="Arial"/>
-        </w:rPr>
-      </w:pPr>
-      <w:r>
-        <w:rPr>
-          <w:rFonts w:ascii="Arial" w:hAnsi="Arial" w:cs="Arial"/>
-        </w:rPr>
-        <w:t>Com base na abordagem proposta, buscou-se introduzir os alunos aos conceitos fundamentais destas técnicas de modulação, além de conduzi-los na configuração e programação de circuitos FPGA utilizando a linguagem VHDL, para que pudessem</w:t>
-      </w:r>
-      <w:r>
-        <w:rPr>
-          <w:rFonts w:ascii="Arial" w:hAnsi="Arial" w:cs="Arial"/>
-        </w:rPr>
-        <w:t xml:space="preserve"> simular tais processos, garantindo</w:t>
-      </w:r>
-      <w:r>
-        <w:rPr>
-          <w:rFonts w:ascii="Arial" w:hAnsi="Arial" w:cs="Arial"/>
-        </w:rPr>
-        <w:t xml:space="preserve"> uma visão </w:t>
-      </w:r>
-      <w:r>
-        <w:rPr>
-          <w:rFonts w:ascii="Arial" w:hAnsi="Arial" w:cs="Arial"/>
-        </w:rPr>
-        <w:t>um pouco mais concreta</w:t>
-      </w:r>
-      <w:r>
-        <w:rPr>
-          <w:rFonts w:ascii="Arial" w:hAnsi="Arial" w:cs="Arial"/>
-        </w:rPr>
-        <w:t xml:space="preserve"> sobre o assunto estuado.</w:t>
-      </w:r>
-    </w:p>
-    <w:p>
-      <w:pPr>
-        <w:jc w:val="both"/>
-        <w:rPr>
-          <w:rFonts w:ascii="Arial" w:hAnsi="Arial" w:cs="Arial"/>
-        </w:rPr>
-      </w:pPr>
-    </w:p>
-    <w:p>
-      <w:pPr>
-        <w:rPr>
-          <w:rFonts w:ascii="Arial" w:hAnsi="Arial" w:cs="Arial"/>
-          <w:b/>
-          <w:bCs/>
-          <w:sz w:val="28"/>
-          <w:szCs w:val="28"/>
-        </w:rPr>
-      </w:pPr>
-      <w:r>
-        <w:rPr>
-          <w:rFonts w:ascii="Arial" w:hAnsi="Arial" w:cs="Arial"/>
-          <w:b/>
-          <w:bCs/>
-          <w:sz w:val="28"/>
-          <w:szCs w:val="28"/>
-        </w:rPr>
-        <w:t>3</w:t>
-      </w:r>
-      <w:r>
-        <w:rPr>
-          <w:rFonts w:ascii="Arial" w:hAnsi="Arial" w:cs="Arial"/>
-          <w:b/>
-          <w:bCs/>
-          <w:sz w:val="28"/>
-          <w:szCs w:val="28"/>
-        </w:rPr>
-        <w:t xml:space="preserve">) </w:t>
-      </w:r>
-      <w:r>
-        <w:rPr>
-          <w:rFonts w:ascii="Arial" w:hAnsi="Arial" w:cs="Arial"/>
-          <w:b/>
-          <w:bCs/>
-          <w:sz w:val="28"/>
-          <w:szCs w:val="28"/>
-        </w:rPr>
-        <w:t>FUNDAMENTAÇÃO TEÓRICA</w:t>
+        <w:t>3) FUNDAMENTAÇÃO TEÓRICA</w:t>
       </w:r>
     </w:p>
     <w:p>
@@ -689,28 +637,19 @@
         <w:rPr>
           <w:rFonts w:ascii="Arial" w:hAnsi="Arial" w:cs="Arial"/>
         </w:rPr>
-        <w:t>. (artigo metrópole).</w:t>
-      </w:r>
-    </w:p>
-    <w:p>
-      <w:pPr>
-        <w:ind w:firstLine="567"/>
-        <w:jc w:val="both"/>
-        <w:rPr>
-          <w:rFonts w:ascii="Arial" w:hAnsi="Arial" w:cs="Arial"/>
-        </w:rPr>
-      </w:pPr>
-      <w:r>
-        <w:rPr>
-          <w:rFonts w:ascii="Arial" w:hAnsi="Arial" w:cs="Arial"/>
-        </w:rPr>
-        <w:t xml:space="preserve">O termo unipolar indica que esta técnica produz um sinal modulado </w:t>
-      </w:r>
-      <w:r>
-        <w:rPr>
-          <w:rFonts w:ascii="Arial" w:hAnsi="Arial" w:cs="Arial"/>
-        </w:rPr>
-        <w:t>que possui apenas um nível. A nomenclatura “Non-Return-to-Zero” denota o fato de o sinal elétrico não voltar para o nível zero no meio do intervalo de um bit (artigo metrópole).</w:t>
+        <w:t>. (</w:t>
+      </w:r>
+      <w:r>
+        <w:rPr>
+          <w:rFonts w:ascii="Arial" w:hAnsi="Arial" w:cs="Arial"/>
+        </w:rPr>
+        <w:t>LUIGLI; SANTOS, 2010</w:t>
+      </w:r>
+      <w:r>
+        <w:rPr>
+          <w:rFonts w:ascii="Arial" w:hAnsi="Arial" w:cs="Arial"/>
+        </w:rPr>
+        <w:t>).</w:t>
       </w:r>
     </w:p>
     <w:p>
@@ -737,6 +676,7 @@
       <w:r>
         <w:rPr>
           <w:rFonts w:ascii="Arial" w:hAnsi="Arial" w:cs="Arial"/>
+          <w:noProof/>
         </w:rPr>
         <w:lastRenderedPageBreak/>
         <w:drawing>
@@ -755,7 +695,7 @@
                     <pic:cNvPicPr/>
                   </pic:nvPicPr>
                   <pic:blipFill>
-                    <a:blip r:embed="rId4"/>
+                    <a:blip r:embed="rId5"/>
                     <a:stretch>
                       <a:fillRect/>
                     </a:stretch>
@@ -805,6 +745,21 @@
       <w:r>
         <w:t xml:space="preserve"> - Modulação NRZ-L</w:t>
       </w:r>
+      <w:r>
+        <w:t xml:space="preserve"> (Fonte: </w:t>
+      </w:r>
+      <w:r>
+        <w:rPr>
+          <w:rFonts w:ascii="Arial" w:hAnsi="Arial" w:cs="Arial"/>
+        </w:rPr>
+        <w:t>FOROUZAN</w:t>
+      </w:r>
+      <w:r>
+        <w:rPr>
+          <w:rFonts w:ascii="Arial" w:hAnsi="Arial" w:cs="Arial"/>
+        </w:rPr>
+        <w:t>, 2008)</w:t>
+      </w:r>
     </w:p>
     <w:p/>
     <w:p>
@@ -825,19 +780,7 @@
         <w:rPr>
           <w:rFonts w:ascii="Arial" w:hAnsi="Arial" w:cs="Arial"/>
         </w:rPr>
-        <w:t xml:space="preserve"> modulação Unipolar NRZ-</w:t>
-      </w:r>
-      <w:r>
-        <w:rPr>
-          <w:rFonts w:ascii="Arial" w:hAnsi="Arial" w:cs="Arial"/>
-        </w:rPr>
-        <w:t>I</w:t>
-      </w:r>
-      <w:r>
-        <w:rPr>
-          <w:rFonts w:ascii="Arial" w:hAnsi="Arial" w:cs="Arial"/>
-        </w:rPr>
-        <w:t xml:space="preserve"> (Non-Return-to-Zero</w:t>
+        <w:t xml:space="preserve"> modulação Unipolar NRZ-I (Non-Return-to-Zero</w:t>
       </w:r>
       <w:r>
         <w:rPr>
@@ -861,7 +804,19 @@
         <w:rPr>
           <w:rFonts w:ascii="Arial" w:hAnsi="Arial" w:cs="Arial"/>
         </w:rPr>
-        <w:t xml:space="preserve"> (geeks4geeks).</w:t>
+        <w:t xml:space="preserve"> (</w:t>
+      </w:r>
+      <w:r>
+        <w:rPr>
+          <w:rFonts w:ascii="Arial" w:hAnsi="Arial" w:cs="Arial"/>
+        </w:rPr>
+        <w:t>Geeks for Geeks, 2026</w:t>
+      </w:r>
+      <w:r>
+        <w:rPr>
+          <w:rFonts w:ascii="Arial" w:hAnsi="Arial" w:cs="Arial"/>
+        </w:rPr>
+        <w:t>).</w:t>
       </w:r>
     </w:p>
     <w:p>
@@ -941,7 +896,7 @@
                     </pic:cNvPicPr>
                   </pic:nvPicPr>
                   <pic:blipFill>
-                    <a:blip r:embed="rId5">
+                    <a:blip r:embed="rId6">
                       <a:extLst>
                         <a:ext uri="{28A0092B-C50C-407E-A947-70E740481C1C}">
                           <a14:useLocalDpi xmlns:a14="http://schemas.microsoft.com/office/drawing/2010/main" val="0"/>
@@ -1005,6 +960,58 @@
       <w:r>
         <w:t xml:space="preserve"> - Modulação NRZ-I</w:t>
       </w:r>
+      <w:r>
+        <w:t xml:space="preserve"> </w:t>
+      </w:r>
+      <w:r>
+        <w:t xml:space="preserve">(Fonte: </w:t>
+      </w:r>
+      <w:r>
+        <w:rPr>
+          <w:rFonts w:ascii="Arial" w:hAnsi="Arial" w:cs="Arial"/>
+        </w:rPr>
+        <w:t>FOROUZAN</w:t>
+      </w:r>
+      <w:r>
+        <w:rPr>
+          <w:rFonts w:ascii="Arial" w:hAnsi="Arial" w:cs="Arial"/>
+        </w:rPr>
+        <w:t>, 2008)</w:t>
+      </w:r>
+    </w:p>
+    <w:p/>
+    <w:p>
+      <w:pPr>
+        <w:ind w:firstLine="567"/>
+        <w:jc w:val="both"/>
+        <w:rPr>
+          <w:rFonts w:ascii="Arial" w:hAnsi="Arial" w:cs="Arial"/>
+        </w:rPr>
+      </w:pPr>
+      <w:r>
+        <w:rPr>
+          <w:rFonts w:ascii="Arial" w:hAnsi="Arial" w:cs="Arial"/>
+        </w:rPr>
+        <w:t>Em ambas as modulações, o</w:t>
+      </w:r>
+      <w:r>
+        <w:rPr>
+          <w:rFonts w:ascii="Arial" w:hAnsi="Arial" w:cs="Arial"/>
+        </w:rPr>
+        <w:t xml:space="preserve"> termo unipolar indica que produz</w:t>
+      </w:r>
+      <w:r>
+        <w:rPr>
+          <w:rFonts w:ascii="Arial" w:hAnsi="Arial" w:cs="Arial"/>
+        </w:rPr>
+        <w:t>em</w:t>
+      </w:r>
+      <w:r>
+        <w:rPr>
+          <w:rFonts w:ascii="Arial" w:hAnsi="Arial" w:cs="Arial"/>
+        </w:rPr>
+        <w:t xml:space="preserve"> um sinal modulado que possui apenas um nível. A nomenclatura “Non-Return-to-Zero” denota o fato de o sinal elétrico não voltar para o nível zero no meio do intervalo de um bit (LUIGLI; SANTOS, 2010).</w:t>
+      </w:r>
     </w:p>
     <w:p>
       <w:pPr>
@@ -1032,9 +1039,80 @@
           <w:sz w:val="28"/>
           <w:szCs w:val="28"/>
         </w:rPr>
-        <w:t>4</w:t>
-      </w:r>
-      <w:r>
+        <w:t>4) METODOLOGIA</w:t>
+      </w:r>
+    </w:p>
+    <w:p>
+      <w:pPr>
+        <w:ind w:firstLine="567"/>
+        <w:jc w:val="both"/>
+        <w:rPr>
+          <w:rFonts w:ascii="Arial" w:hAnsi="Arial" w:cs="Arial"/>
+        </w:rPr>
+      </w:pPr>
+      <w:r>
+        <w:rPr>
+          <w:rFonts w:ascii="Arial" w:hAnsi="Arial" w:cs="Arial"/>
+        </w:rPr>
+        <w:t xml:space="preserve">Para a elaboração deste trabalho, seguiram-se uma série de etapas. Primeiramente, o grupo estudou os conceitos fundamentais das modulações </w:t>
+      </w:r>
+      <w:r>
+        <w:rPr>
+          <w:rFonts w:ascii="Arial" w:hAnsi="Arial" w:cs="Arial"/>
+        </w:rPr>
+        <w:lastRenderedPageBreak/>
+        <w:t>unipolares NRZ-L e NRZ-I, por meio das aulas de comunicação de dados.</w:t>
+      </w:r>
+      <w:r>
+        <w:rPr>
+          <w:rFonts w:ascii="Arial" w:hAnsi="Arial" w:cs="Arial"/>
+        </w:rPr>
+        <w:t xml:space="preserve"> Somado a isso, as aulas de Sistemas Reconfiguráveis trouxeram o conhecimento necessário para a programação de circuitos FPGA.</w:t>
+      </w:r>
+    </w:p>
+    <w:p>
+      <w:pPr>
+        <w:ind w:firstLine="567"/>
+        <w:jc w:val="both"/>
+        <w:rPr>
+          <w:rFonts w:ascii="Arial" w:hAnsi="Arial" w:cs="Arial"/>
+        </w:rPr>
+      </w:pPr>
+      <w:r>
+        <w:rPr>
+          <w:rFonts w:ascii="Arial" w:hAnsi="Arial" w:cs="Arial"/>
+        </w:rPr>
+        <w:t>Em seguida, o projeto detalhou como foi feita a implementação das modulações, por meio da plataforma Vivado, ferramenta esta que foi utilizada para realizar a programação, simulação e gravação do software final no circuito, tudo isso devidamente documentado, para possibilitar a compreensão e reprodução dos resultados obtidos.</w:t>
+      </w:r>
+      <w:r>
+        <w:rPr>
+          <w:rFonts w:ascii="Arial" w:hAnsi="Arial" w:cs="Arial"/>
+        </w:rPr>
+        <w:t xml:space="preserve"> </w:t>
+      </w:r>
+      <w:r>
+        <w:rPr>
+          <w:rFonts w:ascii="Arial" w:hAnsi="Arial" w:cs="Arial"/>
+        </w:rPr>
+        <w:t xml:space="preserve">Como ato final, </w:t>
+      </w:r>
+      <w:r>
+        <w:rPr>
+          <w:rFonts w:ascii="Arial" w:hAnsi="Arial" w:cs="Arial"/>
+        </w:rPr>
+        <w:t>demonstrou-se como as placas devem ser manipuladas para visualizar o comportamento de cada técnica de modulação.</w:t>
+      </w:r>
+    </w:p>
+    <w:p>
+      <w:pPr>
+        <w:jc w:val="both"/>
+        <w:rPr>
+          <w:rFonts w:ascii="Arial" w:hAnsi="Arial" w:cs="Arial"/>
+        </w:rPr>
+      </w:pPr>
+    </w:p>
+    <w:p>
+      <w:pPr>
         <w:rPr>
           <w:rFonts w:ascii="Arial" w:hAnsi="Arial" w:cs="Arial"/>
           <w:b/>
@@ -1042,8 +1120,7 @@
           <w:sz w:val="28"/>
           <w:szCs w:val="28"/>
         </w:rPr>
-        <w:t xml:space="preserve">) </w:t>
-      </w:r>
+      </w:pPr>
       <w:r>
         <w:rPr>
           <w:rFonts w:ascii="Arial" w:hAnsi="Arial" w:cs="Arial"/>
@@ -1052,56 +1129,377 @@
           <w:sz w:val="28"/>
           <w:szCs w:val="28"/>
         </w:rPr>
-        <w:t>METODOLOGIA</w:t>
-      </w:r>
-    </w:p>
-    <w:p>
-      <w:pPr>
-        <w:ind w:firstLine="567"/>
-        <w:jc w:val="both"/>
-        <w:rPr>
-          <w:rFonts w:ascii="Arial" w:hAnsi="Arial" w:cs="Arial"/>
-        </w:rPr>
-      </w:pPr>
-      <w:r>
-        <w:rPr>
-          <w:rFonts w:ascii="Arial" w:hAnsi="Arial" w:cs="Arial"/>
-        </w:rPr>
-        <w:t>Para a elaboração deste trabalho, seguiram-se uma série de etapas. Primeiramente, o grupo estudou os conceitos fundamentais das modulações unipolares NRZ-L e NRZ-I, por meio das aulas de comunicação de dados.</w:t>
-      </w:r>
-      <w:r>
-        <w:rPr>
-          <w:rFonts w:ascii="Arial" w:hAnsi="Arial" w:cs="Arial"/>
-        </w:rPr>
-        <w:t xml:space="preserve"> Somado a isso, as aulas de Sistemas Reconfiguráveis trouxeram o conhecimento necessário para a programação de circuitos FPGA.</w:t>
-      </w:r>
-    </w:p>
-    <w:p>
-      <w:pPr>
-        <w:ind w:firstLine="567"/>
-        <w:jc w:val="both"/>
-        <w:rPr>
-          <w:rFonts w:ascii="Arial" w:hAnsi="Arial" w:cs="Arial"/>
-        </w:rPr>
-      </w:pPr>
-      <w:r>
-        <w:rPr>
-          <w:rFonts w:ascii="Arial" w:hAnsi="Arial" w:cs="Arial"/>
-        </w:rPr>
-        <w:t xml:space="preserve">Em seguida, o projeto detalhou como foi feita a implementação das modulações, por meio da plataforma Vivado, ferramenta esta que foi utilizada </w:t>
-      </w:r>
+        <w:t>5) DESENVOLVIMENTO</w:t>
+      </w:r>
+    </w:p>
+    <w:p>
+      <w:pPr>
+        <w:ind w:firstLine="567"/>
+        <w:jc w:val="both"/>
+        <w:rPr>
+          <w:rFonts w:ascii="Arial" w:hAnsi="Arial" w:cs="Arial"/>
+        </w:rPr>
+      </w:pPr>
+      <w:r>
+        <w:rPr>
+          <w:rFonts w:ascii="Arial" w:hAnsi="Arial" w:cs="Arial"/>
+        </w:rPr>
+        <w:t>Conforme já abordado, o</w:t>
+      </w:r>
+      <w:r>
+        <w:rPr>
+          <w:rFonts w:ascii="Arial" w:hAnsi="Arial" w:cs="Arial"/>
+        </w:rPr>
+        <w:t>s projetos</w:t>
+      </w:r>
+      <w:r>
+        <w:rPr>
+          <w:rFonts w:ascii="Arial" w:hAnsi="Arial" w:cs="Arial"/>
+        </w:rPr>
+        <w:t xml:space="preserve"> </w:t>
+      </w:r>
+      <w:r>
+        <w:rPr>
+          <w:rFonts w:ascii="Arial" w:hAnsi="Arial" w:cs="Arial"/>
+        </w:rPr>
+        <w:t>moduladores NRZ-L e NRZ-I foram implementados em VHDL</w:t>
+      </w:r>
+      <w:r>
+        <w:rPr>
+          <w:rFonts w:ascii="Arial" w:hAnsi="Arial" w:cs="Arial"/>
+        </w:rPr>
+        <w:t>,</w:t>
+      </w:r>
+      <w:r>
+        <w:rPr>
+          <w:rFonts w:ascii="Arial" w:hAnsi="Arial" w:cs="Arial"/>
+        </w:rPr>
+        <w:t xml:space="preserve"> com o objetivo de simular a transmissão de sinais digitais utilizando diferentes técnicas de codificação de linha. Em ambos os casos, foi utilizada a placa </w:t>
+      </w:r>
+      <w:r>
+        <w:rPr>
+          <w:rFonts w:ascii="Arial" w:hAnsi="Arial" w:cs="Arial"/>
+        </w:rPr>
+        <w:t xml:space="preserve">FPGA </w:t>
+      </w:r>
+      <w:r>
+        <w:rPr>
+          <w:rFonts w:ascii="Arial" w:hAnsi="Arial" w:cs="Arial"/>
+        </w:rPr>
+        <w:t>Basys3</w:t>
+      </w:r>
+      <w:r>
+        <w:rPr>
+          <w:rFonts w:ascii="Arial" w:hAnsi="Arial" w:cs="Arial"/>
+        </w:rPr>
+        <w:t>.</w:t>
+      </w:r>
+    </w:p>
+    <w:p>
+      <w:pPr>
+        <w:ind w:firstLine="567"/>
+        <w:jc w:val="both"/>
+        <w:rPr>
+          <w:rFonts w:ascii="Arial" w:hAnsi="Arial" w:cs="Arial"/>
+        </w:rPr>
+      </w:pPr>
+      <w:r>
+        <w:rPr>
+          <w:rFonts w:ascii="Arial" w:hAnsi="Arial" w:cs="Arial"/>
+        </w:rPr>
+        <w:t>Dentre outros recursos, este circuito possui um conjunto de 16 Switches e 16 LEDs, além de saídas analógicas</w:t>
+      </w:r>
+      <w:r>
+        <w:rPr>
+          <w:rFonts w:ascii="Arial" w:hAnsi="Arial" w:cs="Arial"/>
+        </w:rPr>
+        <w:t xml:space="preserve"> PMOD</w:t>
+      </w:r>
+      <w:r>
+        <w:rPr>
+          <w:rFonts w:ascii="Arial" w:hAnsi="Arial" w:cs="Arial"/>
+        </w:rPr>
+        <w:t>. Estes itens foram escolhidos para servirem como o input de dados e</w:t>
+      </w:r>
+      <w:r>
+        <w:rPr>
+          <w:rFonts w:ascii="Arial" w:hAnsi="Arial" w:cs="Arial"/>
+        </w:rPr>
+        <w:t xml:space="preserve"> </w:t>
+      </w:r>
+      <w:r>
+        <w:rPr>
+          <w:rFonts w:ascii="Arial" w:hAnsi="Arial" w:cs="Arial"/>
+        </w:rPr>
+        <w:t>duas formas de se representar a saída do sinal modulado, respectivamente.</w:t>
+      </w:r>
+    </w:p>
+    <w:p>
+      <w:pPr>
+        <w:ind w:firstLine="567"/>
+        <w:jc w:val="both"/>
+        <w:rPr>
+          <w:rFonts w:ascii="Arial" w:hAnsi="Arial" w:cs="Arial"/>
+        </w:rPr>
+      </w:pPr>
+      <w:r>
+        <w:rPr>
+          <w:rFonts w:ascii="Arial" w:hAnsi="Arial" w:cs="Arial"/>
+        </w:rPr>
+        <w:t>A lógica dos circuitos foi baseada em um processo sincronizado pela borda de subida do clock</w:t>
+      </w:r>
+      <w:r>
+        <w:rPr>
+          <w:rFonts w:ascii="Arial" w:hAnsi="Arial" w:cs="Arial"/>
+        </w:rPr>
+        <w:t xml:space="preserve">. Ela foi implementada em ambos os casos para iterar constantemente pelo vetor dos bits de entrada e atualizar o estado dos LEDs ou do sinal analógico exportado. Esta abordagem foi utilizada por ter </w:t>
+      </w:r>
+      <w:r>
+        <w:rPr>
+          <w:rFonts w:ascii="Arial" w:hAnsi="Arial" w:cs="Arial"/>
+        </w:rPr>
+        <w:t>se mostrado simples de gerenciar, porém suficiente para a compreensão.</w:t>
+      </w:r>
+    </w:p>
+    <w:p>
+      <w:pPr>
+        <w:ind w:firstLine="567"/>
+        <w:jc w:val="both"/>
+        <w:rPr>
+          <w:rFonts w:ascii="Arial" w:hAnsi="Arial" w:cs="Arial"/>
+        </w:rPr>
+      </w:pPr>
+      <w:r>
+        <w:rPr>
+          <w:rFonts w:ascii="Arial" w:hAnsi="Arial" w:cs="Arial"/>
+        </w:rPr>
+        <w:t xml:space="preserve">No </w:t>
+      </w:r>
+      <w:r>
+        <w:rPr>
+          <w:rFonts w:ascii="Arial" w:hAnsi="Arial" w:cs="Arial"/>
+        </w:rPr>
+        <w:t>projeto do modulador</w:t>
+      </w:r>
+      <w:r>
+        <w:rPr>
+          <w:rFonts w:ascii="Arial" w:hAnsi="Arial" w:cs="Arial"/>
+        </w:rPr>
+        <w:t xml:space="preserve"> </w:t>
+      </w:r>
+      <w:r>
+        <w:rPr>
+          <w:rFonts w:ascii="Arial" w:hAnsi="Arial" w:cs="Arial"/>
+        </w:rPr>
+        <w:t xml:space="preserve">Unipolar </w:t>
+      </w:r>
+      <w:r>
+        <w:rPr>
+          <w:rFonts w:ascii="Arial" w:hAnsi="Arial" w:cs="Arial"/>
+        </w:rPr>
+        <w:t>NRZ-L</w:t>
+      </w:r>
+      <w:r>
+        <w:rPr>
+          <w:rFonts w:ascii="Arial" w:hAnsi="Arial" w:cs="Arial"/>
+        </w:rPr>
+        <w:t xml:space="preserve"> especificamente</w:t>
+      </w:r>
+      <w:r>
+        <w:rPr>
+          <w:rFonts w:ascii="Arial" w:hAnsi="Arial" w:cs="Arial"/>
+        </w:rPr>
+        <w:t>, a implementação consistiu em associar diretamente o valor lógico</w:t>
+      </w:r>
+      <w:r>
+        <w:rPr>
+          <w:rFonts w:ascii="Arial" w:hAnsi="Arial" w:cs="Arial"/>
+        </w:rPr>
+        <w:t xml:space="preserve"> representado pelos switches</w:t>
+      </w:r>
+      <w:r>
+        <w:rPr>
+          <w:rFonts w:ascii="Arial" w:hAnsi="Arial" w:cs="Arial"/>
+        </w:rPr>
+        <w:t xml:space="preserve"> ao nível do sinal de saída</w:t>
+      </w:r>
+      <w:r>
+        <w:rPr>
+          <w:rFonts w:ascii="Arial" w:hAnsi="Arial" w:cs="Arial"/>
+        </w:rPr>
+        <w:t>. Dessa forma, considerando 16 switches, se o conjunto de switches representassem, por exemplo, a sequência “1011001110001111” (1 = switch ativado; 0 = switch desativado), os LEDs e a saída analógica também representariam essa mesma sequência.</w:t>
+      </w:r>
+    </w:p>
+    <w:p>
+      <w:pPr>
+        <w:ind w:firstLine="567"/>
+        <w:jc w:val="both"/>
+        <w:rPr>
+          <w:rFonts w:ascii="Arial" w:hAnsi="Arial" w:cs="Arial"/>
+        </w:rPr>
+      </w:pPr>
+      <w:r>
+        <w:rPr>
+          <w:rFonts w:ascii="Arial" w:hAnsi="Arial" w:cs="Arial"/>
+        </w:rPr>
+        <w:t xml:space="preserve">No caso dos leds (que também são 16), luzes acessas e apagadas (1 e 0). No caso do sinal via PMOD, o valor exportado iria assumir o VCC de 3 volts em nível alto ou zero ao longo do tempo.  </w:t>
+      </w:r>
+    </w:p>
+    <w:p>
+      <w:pPr>
+        <w:ind w:firstLine="567"/>
+        <w:jc w:val="both"/>
+        <w:rPr>
+          <w:rFonts w:ascii="Arial" w:hAnsi="Arial" w:cs="Arial"/>
+        </w:rPr>
+      </w:pPr>
+      <w:r>
+        <w:rPr>
+          <w:rFonts w:ascii="Arial" w:hAnsi="Arial" w:cs="Arial"/>
+        </w:rPr>
+        <w:t xml:space="preserve">Já no </w:t>
+      </w:r>
+      <w:r>
+        <w:rPr>
+          <w:rFonts w:ascii="Arial" w:hAnsi="Arial" w:cs="Arial"/>
+        </w:rPr>
+        <w:t xml:space="preserve">modulador Unipolar </w:t>
+      </w:r>
+      <w:r>
+        <w:rPr>
+          <w:rFonts w:ascii="Arial" w:hAnsi="Arial" w:cs="Arial"/>
+        </w:rPr>
+        <w:t xml:space="preserve">NRZ-I, </w:t>
+      </w:r>
+      <w:r>
+        <w:rPr>
+          <w:rFonts w:ascii="Arial" w:hAnsi="Arial" w:cs="Arial"/>
+        </w:rPr>
+        <w:t>a lógica se baseou no uso</w:t>
+      </w:r>
+      <w:r>
+        <w:rPr>
+          <w:rFonts w:ascii="Arial" w:hAnsi="Arial" w:cs="Arial"/>
+        </w:rPr>
+        <w:t xml:space="preserve"> de uma variável de nível que é invertida sempre que o bit transmitido é ‘1’, mantendo o estado anterior quando o bit é ‘0’.</w:t>
+      </w:r>
+    </w:p>
+    <w:p>
+      <w:pPr>
+        <w:ind w:firstLine="567"/>
+        <w:jc w:val="both"/>
+        <w:rPr>
+          <w:rFonts w:ascii="Arial" w:hAnsi="Arial" w:cs="Arial"/>
+        </w:rPr>
+      </w:pPr>
       <w:r>
         <w:rPr>
           <w:rFonts w:ascii="Arial" w:hAnsi="Arial" w:cs="Arial"/>
         </w:rPr>
         <w:lastRenderedPageBreak/>
-        <w:t xml:space="preserve">para realizar a programação, simulação e gravação do software final no circuito, tudo isso devidamente documentado, para possibilitar a compreensão e reprodução dos resultados obtidos. Como ato final, </w:t>
-      </w:r>
-      <w:r>
-        <w:rPr>
-          <w:rFonts w:ascii="Arial" w:hAnsi="Arial" w:cs="Arial"/>
-        </w:rPr>
-        <w:t>demonstrou-se como as placas devem ser manipuladas para visualizar o comportamento de cada técnica de modulação.</w:t>
+        <w:t>Assim como no outro modulador, o vetor de dados de entrada controlado pelos switches também é iterado bit a bit, aplicando essa regra de inversão ou manutenção de estado em cada um deles, para a formação do pulso de saída representado nos LEDs ou na saída PMOD.</w:t>
+      </w:r>
+    </w:p>
+    <w:p>
+      <w:pPr>
+        <w:ind w:firstLine="567"/>
+        <w:jc w:val="both"/>
+        <w:rPr>
+          <w:rFonts w:ascii="Arial" w:hAnsi="Arial" w:cs="Arial"/>
+        </w:rPr>
+      </w:pPr>
+      <w:r>
+        <w:rPr>
+          <w:rFonts w:ascii="Arial" w:hAnsi="Arial" w:cs="Arial"/>
+        </w:rPr>
+        <w:t>Pensando em deixar o código de ambas as implementações um pouco mais parametrizável e flexível, neles foram incluídos dois parâmetros que podem ser modificados conforme a necessidade: CICLOS_POR_BIT e NUM_BITS, que especificam a quantidade de ciclos de clock usadas para transmitir cada bit e quantos bits serão utilizados na simulação.</w:t>
+      </w:r>
+    </w:p>
+    <w:p>
+      <w:pPr>
+        <w:ind w:firstLine="567"/>
+        <w:jc w:val="both"/>
+        <w:rPr>
+          <w:rFonts w:ascii="Arial" w:hAnsi="Arial" w:cs="Arial"/>
+        </w:rPr>
+      </w:pPr>
+      <w:r>
+        <w:rPr>
+          <w:rFonts w:ascii="Arial" w:hAnsi="Arial" w:cs="Arial"/>
+        </w:rPr>
+        <w:t>De</w:t>
+      </w:r>
+      <w:r>
+        <w:rPr>
+          <w:rFonts w:ascii="Arial" w:hAnsi="Arial" w:cs="Arial"/>
+        </w:rPr>
+        <w:t>ntre as principais dificuldades encontradas</w:t>
+      </w:r>
+      <w:r>
+        <w:rPr>
+          <w:rFonts w:ascii="Arial" w:hAnsi="Arial" w:cs="Arial"/>
+        </w:rPr>
+        <w:t>, pode ser citado o controle</w:t>
+      </w:r>
+      <w:r>
+        <w:rPr>
+          <w:rFonts w:ascii="Arial" w:hAnsi="Arial" w:cs="Arial"/>
+        </w:rPr>
+        <w:t xml:space="preserve"> do sincronismo entre o contador de clock e o índice dos bits transmitidos, especialmente no NRZ-I, </w:t>
+      </w:r>
+      <w:r>
+        <w:rPr>
+          <w:rFonts w:ascii="Arial" w:hAnsi="Arial" w:cs="Arial"/>
+        </w:rPr>
+        <w:t>por conta da</w:t>
+      </w:r>
+      <w:r>
+        <w:rPr>
+          <w:rFonts w:ascii="Arial" w:hAnsi="Arial" w:cs="Arial"/>
+        </w:rPr>
+        <w:t xml:space="preserve"> </w:t>
+      </w:r>
+      <w:r>
+        <w:rPr>
+          <w:rFonts w:ascii="Arial" w:hAnsi="Arial" w:cs="Arial"/>
+        </w:rPr>
+        <w:t>lógica de</w:t>
+      </w:r>
+      <w:r>
+        <w:rPr>
+          <w:rFonts w:ascii="Arial" w:hAnsi="Arial" w:cs="Arial"/>
+        </w:rPr>
+        <w:t xml:space="preserve"> manter </w:t>
+      </w:r>
+      <w:r>
+        <w:rPr>
+          <w:rFonts w:ascii="Arial" w:hAnsi="Arial" w:cs="Arial"/>
+        </w:rPr>
+        <w:t>ou</w:t>
+      </w:r>
+      <w:r>
+        <w:rPr>
+          <w:rFonts w:ascii="Arial" w:hAnsi="Arial" w:cs="Arial"/>
+        </w:rPr>
+        <w:t xml:space="preserve"> inverter o nível do sinal </w:t>
+      </w:r>
+      <w:r>
+        <w:rPr>
+          <w:rFonts w:ascii="Arial" w:hAnsi="Arial" w:cs="Arial"/>
+        </w:rPr>
+        <w:t>dependendo do bit processado no momento</w:t>
+      </w:r>
+      <w:r>
+        <w:rPr>
+          <w:rFonts w:ascii="Arial" w:hAnsi="Arial" w:cs="Arial"/>
+        </w:rPr>
+        <w:t xml:space="preserve">. </w:t>
+      </w:r>
+      <w:r>
+        <w:rPr>
+          <w:rFonts w:ascii="Arial" w:hAnsi="Arial" w:cs="Arial"/>
+        </w:rPr>
+        <w:t>Com o auxílio das variáveis internas e utilizando o depurador do Vivado (para visualizar fluxo de execução passo a passo), o problema foi resolvido.</w:t>
       </w:r>
     </w:p>
     <w:p>
@@ -1130,7 +1528,7 @@
           <w:sz w:val="28"/>
           <w:szCs w:val="28"/>
         </w:rPr>
-        <w:t>5</w:t>
+        <w:t>7</w:t>
       </w:r>
       <w:r>
         <w:rPr>
@@ -1150,16 +1548,1552 @@
           <w:sz w:val="28"/>
           <w:szCs w:val="28"/>
         </w:rPr>
-        <w:t>DESENVOLVIMENTO</w:t>
-      </w:r>
-    </w:p>
-    <w:p>
-      <w:pPr>
-        <w:jc w:val="both"/>
-        <w:rPr>
-          <w:rFonts w:ascii="Arial" w:hAnsi="Arial" w:cs="Arial"/>
-        </w:rPr>
-      </w:pPr>
+        <w:t>RESULTADOS</w:t>
+      </w:r>
+    </w:p>
+    <w:p>
+      <w:pPr>
+        <w:ind w:firstLine="567"/>
+        <w:rPr>
+          <w:rFonts w:ascii="Arial" w:hAnsi="Arial" w:cs="Arial"/>
+        </w:rPr>
+      </w:pPr>
+      <w:r>
+        <w:rPr>
+          <w:rFonts w:ascii="Arial" w:hAnsi="Arial" w:cs="Arial"/>
+        </w:rPr>
+        <w:t>Ao final do processo, foi possível concluir os objetivos almejados, programando a placa FPGA para simular o comportamento dos modulares unipolares.</w:t>
+      </w:r>
+    </w:p>
+    <w:p>
+      <w:pPr>
+        <w:ind w:firstLine="567"/>
+        <w:rPr>
+          <w:rFonts w:ascii="Arial" w:hAnsi="Arial" w:cs="Arial"/>
+        </w:rPr>
+      </w:pPr>
+      <w:r>
+        <w:rPr>
+          <w:rFonts w:ascii="Arial" w:hAnsi="Arial" w:cs="Arial"/>
+        </w:rPr>
+        <w:t>Durante os testes ainda sem a placa física, coletou-se o formato dos pulsos de saída das modulações durante simulações de testbench, diretamente pelo Vivado. Por meio das figuras 3 e 4, é possível ver os sinais dos moduladores NRZ-L e NRZ-I, respectivamente:</w:t>
+      </w:r>
+    </w:p>
+    <w:p>
+      <w:pPr>
+        <w:keepNext/>
+        <w:jc w:val="center"/>
+      </w:pPr>
+      <w:r>
+        <w:rPr>
+          <w:rFonts w:ascii="Arial" w:hAnsi="Arial" w:cs="Arial"/>
+          <w:noProof/>
+        </w:rPr>
+        <w:drawing>
+          <wp:inline distT="0" distB="0" distL="0" distR="0" wp14:anchorId="2CB0B073" wp14:editId="722B5338">
+            <wp:extent cx="5358737" cy="1974272"/>
+            <wp:effectExtent l="0" t="0" r="0" b="6985"/>
+            <wp:docPr id="1600219651" name="Imagem 1"/>
+            <wp:cNvGraphicFramePr>
+              <a:graphicFrameLocks xmlns:a="http://schemas.openxmlformats.org/drawingml/2006/main" noChangeAspect="1"/>
+            </wp:cNvGraphicFramePr>
+            <a:graphic xmlns:a="http://schemas.openxmlformats.org/drawingml/2006/main">
+              <a:graphicData uri="http://schemas.openxmlformats.org/drawingml/2006/picture">
+                <pic:pic xmlns:pic="http://schemas.openxmlformats.org/drawingml/2006/picture">
+                  <pic:nvPicPr>
+                    <pic:cNvPr id="1600219651" name="Imagem 1"/>
+                    <pic:cNvPicPr/>
+                  </pic:nvPicPr>
+                  <pic:blipFill>
+                    <a:blip r:embed="rId7" cstate="print">
+                      <a:extLst>
+                        <a:ext uri="{28A0092B-C50C-407E-A947-70E740481C1C}">
+                          <a14:useLocalDpi xmlns:a14="http://schemas.microsoft.com/office/drawing/2010/main" val="0"/>
+                        </a:ext>
+                      </a:extLst>
+                    </a:blip>
+                    <a:stretch>
+                      <a:fillRect/>
+                    </a:stretch>
+                  </pic:blipFill>
+                  <pic:spPr>
+                    <a:xfrm>
+                      <a:off x="0" y="0"/>
+                      <a:ext cx="5371239" cy="1978878"/>
+                    </a:xfrm>
+                    <a:prstGeom prst="rect">
+                      <a:avLst/>
+                    </a:prstGeom>
+                  </pic:spPr>
+                </pic:pic>
+              </a:graphicData>
+            </a:graphic>
+          </wp:inline>
+        </w:drawing>
+      </w:r>
+    </w:p>
+    <w:p>
+      <w:pPr>
+        <w:pStyle w:val="Legenda"/>
+        <w:jc w:val="center"/>
+      </w:pPr>
+      <w:r>
+        <w:t xml:space="preserve">Figura </w:t>
+      </w:r>
+      <w:r>
+        <w:fldChar w:fldCharType="begin"/>
+      </w:r>
+      <w:r>
+        <w:instrText xml:space="preserve"> SEQ Figura \* ARABIC </w:instrText>
+      </w:r>
+      <w:r>
+        <w:fldChar w:fldCharType="separate"/>
+      </w:r>
+      <w:r>
+        <w:rPr>
+          <w:noProof/>
+        </w:rPr>
+        <w:t>3</w:t>
+      </w:r>
+      <w:r>
+        <w:fldChar w:fldCharType="end"/>
+      </w:r>
+      <w:r>
+        <w:t xml:space="preserve"> - Pulso modulado com NRZ-L</w:t>
+      </w:r>
+      <w:r>
+        <w:t xml:space="preserve"> (Fonte: própria)</w:t>
+      </w:r>
+    </w:p>
+    <w:p/>
+    <w:p>
+      <w:pPr>
+        <w:keepNext/>
+      </w:pPr>
+      <w:r>
+        <w:rPr>
+          <w:rFonts w:ascii="Arial" w:hAnsi="Arial" w:cs="Arial"/>
+          <w:noProof/>
+        </w:rPr>
+        <w:lastRenderedPageBreak/>
+        <w:drawing>
+          <wp:inline distT="0" distB="0" distL="0" distR="0" wp14:anchorId="6FA9A361" wp14:editId="4488408D">
+            <wp:extent cx="5419068" cy="1981200"/>
+            <wp:effectExtent l="0" t="0" r="0" b="0"/>
+            <wp:docPr id="1989688676" name="Imagem 1"/>
+            <wp:cNvGraphicFramePr>
+              <a:graphicFrameLocks xmlns:a="http://schemas.openxmlformats.org/drawingml/2006/main" noChangeAspect="1"/>
+            </wp:cNvGraphicFramePr>
+            <a:graphic xmlns:a="http://schemas.openxmlformats.org/drawingml/2006/main">
+              <a:graphicData uri="http://schemas.openxmlformats.org/drawingml/2006/picture">
+                <pic:pic xmlns:pic="http://schemas.openxmlformats.org/drawingml/2006/picture">
+                  <pic:nvPicPr>
+                    <pic:cNvPr id="1600219651" name="Imagem 1"/>
+                    <pic:cNvPicPr/>
+                  </pic:nvPicPr>
+                  <pic:blipFill>
+                    <a:blip r:embed="rId8" cstate="print">
+                      <a:extLst>
+                        <a:ext uri="{28A0092B-C50C-407E-A947-70E740481C1C}">
+                          <a14:useLocalDpi xmlns:a14="http://schemas.microsoft.com/office/drawing/2010/main" val="0"/>
+                        </a:ext>
+                      </a:extLst>
+                    </a:blip>
+                    <a:stretch>
+                      <a:fillRect/>
+                    </a:stretch>
+                  </pic:blipFill>
+                  <pic:spPr>
+                    <a:xfrm>
+                      <a:off x="0" y="0"/>
+                      <a:ext cx="5437692" cy="1988009"/>
+                    </a:xfrm>
+                    <a:prstGeom prst="rect">
+                      <a:avLst/>
+                    </a:prstGeom>
+                  </pic:spPr>
+                </pic:pic>
+              </a:graphicData>
+            </a:graphic>
+          </wp:inline>
+        </w:drawing>
+      </w:r>
+    </w:p>
+    <w:p>
+      <w:pPr>
+        <w:pStyle w:val="Legenda"/>
+        <w:jc w:val="center"/>
+      </w:pPr>
+      <w:r>
+        <w:t xml:space="preserve">Figura </w:t>
+      </w:r>
+      <w:r>
+        <w:fldChar w:fldCharType="begin"/>
+      </w:r>
+      <w:r>
+        <w:instrText xml:space="preserve"> SEQ Figura \* ARABIC </w:instrText>
+      </w:r>
+      <w:r>
+        <w:fldChar w:fldCharType="separate"/>
+      </w:r>
+      <w:r>
+        <w:rPr>
+          <w:noProof/>
+        </w:rPr>
+        <w:t>4</w:t>
+      </w:r>
+      <w:r>
+        <w:fldChar w:fldCharType="end"/>
+      </w:r>
+      <w:r>
+        <w:t xml:space="preserve"> - Pulso modulado com NRZ-I</w:t>
+      </w:r>
+      <w:r>
+        <w:t xml:space="preserve"> </w:t>
+      </w:r>
+      <w:r>
+        <w:t>(Fonte: própria)</w:t>
+      </w:r>
+    </w:p>
+    <w:p/>
+    <w:p>
+      <w:pPr>
+        <w:ind w:firstLine="567"/>
+      </w:pPr>
+      <w:r>
+        <w:t>Em ambos os casos, foram simuladas a entrada de uma sequência de bits qualquer por meio do vetor “entrada”, cuja respectiva saída modulada está visível pela variável “saida_testbench”.</w:t>
+      </w:r>
+    </w:p>
+    <w:p>
+      <w:pPr>
+        <w:ind w:firstLine="567"/>
+      </w:pPr>
+      <w:r>
+        <w:t>Na fase de implementação do código na placa, a princípio apenas com a utilização dos LEDs como representação do pulso modulado, foi possível constatar os seguintes comportamentos das modulações, representadas pelas figuras 5 e 6 (NRZ-L e NRZ-I):</w:t>
+      </w:r>
+    </w:p>
+    <w:p>
+      <w:pPr>
+        <w:ind w:firstLine="567"/>
+      </w:pPr>
+    </w:p>
+    <w:p>
+      <w:pPr>
+        <w:keepNext/>
+        <w:jc w:val="center"/>
+      </w:pPr>
+      <w:r>
+        <w:rPr>
+          <w:rFonts w:ascii="Arial" w:hAnsi="Arial" w:cs="Arial"/>
+          <w:noProof/>
+        </w:rPr>
+        <w:drawing>
+          <wp:inline distT="0" distB="0" distL="0" distR="0" wp14:anchorId="3AA898D7" wp14:editId="70FC3D21">
+            <wp:extent cx="3931617" cy="2946400"/>
+            <wp:effectExtent l="0" t="0" r="0" b="6350"/>
+            <wp:docPr id="848502697" name="Imagem 14"/>
+            <wp:cNvGraphicFramePr>
+              <a:graphicFrameLocks xmlns:a="http://schemas.openxmlformats.org/drawingml/2006/main" noChangeAspect="1"/>
+            </wp:cNvGraphicFramePr>
+            <a:graphic xmlns:a="http://schemas.openxmlformats.org/drawingml/2006/main">
+              <a:graphicData uri="http://schemas.openxmlformats.org/drawingml/2006/picture">
+                <pic:pic xmlns:pic="http://schemas.openxmlformats.org/drawingml/2006/picture">
+                  <pic:nvPicPr>
+                    <pic:cNvPr id="0" name="Picture 45"/>
+                    <pic:cNvPicPr>
+                      <a:picLocks noChangeAspect="1" noChangeArrowheads="1"/>
+                    </pic:cNvPicPr>
+                  </pic:nvPicPr>
+                  <pic:blipFill>
+                    <a:blip r:embed="rId9" cstate="print">
+                      <a:extLst>
+                        <a:ext uri="{28A0092B-C50C-407E-A947-70E740481C1C}">
+                          <a14:useLocalDpi xmlns:a14="http://schemas.microsoft.com/office/drawing/2010/main" val="0"/>
+                        </a:ext>
+                      </a:extLst>
+                    </a:blip>
+                    <a:srcRect/>
+                    <a:stretch>
+                      <a:fillRect/>
+                    </a:stretch>
+                  </pic:blipFill>
+                  <pic:spPr bwMode="auto">
+                    <a:xfrm>
+                      <a:off x="0" y="0"/>
+                      <a:ext cx="3941270" cy="2953634"/>
+                    </a:xfrm>
+                    <a:prstGeom prst="rect">
+                      <a:avLst/>
+                    </a:prstGeom>
+                    <a:noFill/>
+                    <a:ln>
+                      <a:noFill/>
+                    </a:ln>
+                  </pic:spPr>
+                </pic:pic>
+              </a:graphicData>
+            </a:graphic>
+          </wp:inline>
+        </w:drawing>
+      </w:r>
+    </w:p>
+    <w:p>
+      <w:pPr>
+        <w:pStyle w:val="Legenda"/>
+        <w:jc w:val="center"/>
+      </w:pPr>
+      <w:r>
+        <w:t xml:space="preserve">Figura </w:t>
+      </w:r>
+      <w:r>
+        <w:fldChar w:fldCharType="begin"/>
+      </w:r>
+      <w:r>
+        <w:instrText xml:space="preserve"> SEQ Figura \* ARABIC </w:instrText>
+      </w:r>
+      <w:r>
+        <w:fldChar w:fldCharType="separate"/>
+      </w:r>
+      <w:r>
+        <w:rPr>
+          <w:noProof/>
+        </w:rPr>
+        <w:t>5</w:t>
+      </w:r>
+      <w:r>
+        <w:fldChar w:fldCharType="end"/>
+      </w:r>
+      <w:r>
+        <w:t xml:space="preserve"> - Modulação Unipolar NRZ-L representada via LEDs</w:t>
+      </w:r>
+      <w:r>
+        <w:t xml:space="preserve"> </w:t>
+      </w:r>
+      <w:r>
+        <w:t>(Fonte: própria)</w:t>
+      </w:r>
+    </w:p>
+    <w:p/>
+    <w:p/>
+    <w:p/>
+    <w:p>
+      <w:pPr>
+        <w:keepNext/>
+        <w:jc w:val="center"/>
+      </w:pPr>
+      <w:r>
+        <w:rPr>
+          <w:rFonts w:ascii="Arial" w:hAnsi="Arial" w:cs="Arial"/>
+          <w:noProof/>
+        </w:rPr>
+        <w:lastRenderedPageBreak/>
+        <w:drawing>
+          <wp:inline distT="0" distB="0" distL="0" distR="0" wp14:anchorId="527C703D" wp14:editId="0AEAA29D">
+            <wp:extent cx="3938178" cy="2953634"/>
+            <wp:effectExtent l="0" t="0" r="5715" b="0"/>
+            <wp:docPr id="749043601" name="Imagem 14"/>
+            <wp:cNvGraphicFramePr>
+              <a:graphicFrameLocks xmlns:a="http://schemas.openxmlformats.org/drawingml/2006/main" noChangeAspect="1"/>
+            </wp:cNvGraphicFramePr>
+            <a:graphic xmlns:a="http://schemas.openxmlformats.org/drawingml/2006/main">
+              <a:graphicData uri="http://schemas.openxmlformats.org/drawingml/2006/picture">
+                <pic:pic xmlns:pic="http://schemas.openxmlformats.org/drawingml/2006/picture">
+                  <pic:nvPicPr>
+                    <pic:cNvPr id="848502697" name="Imagem 14"/>
+                    <pic:cNvPicPr>
+                      <a:picLocks noChangeAspect="1" noChangeArrowheads="1"/>
+                    </pic:cNvPicPr>
+                  </pic:nvPicPr>
+                  <pic:blipFill>
+                    <a:blip r:embed="rId10" cstate="print">
+                      <a:extLst>
+                        <a:ext uri="{28A0092B-C50C-407E-A947-70E740481C1C}">
+                          <a14:useLocalDpi xmlns:a14="http://schemas.microsoft.com/office/drawing/2010/main" val="0"/>
+                        </a:ext>
+                      </a:extLst>
+                    </a:blip>
+                    <a:stretch>
+                      <a:fillRect/>
+                    </a:stretch>
+                  </pic:blipFill>
+                  <pic:spPr bwMode="auto">
+                    <a:xfrm>
+                      <a:off x="0" y="0"/>
+                      <a:ext cx="3938178" cy="2953634"/>
+                    </a:xfrm>
+                    <a:prstGeom prst="rect">
+                      <a:avLst/>
+                    </a:prstGeom>
+                    <a:noFill/>
+                    <a:ln>
+                      <a:noFill/>
+                    </a:ln>
+                  </pic:spPr>
+                </pic:pic>
+              </a:graphicData>
+            </a:graphic>
+          </wp:inline>
+        </w:drawing>
+      </w:r>
+    </w:p>
+    <w:p>
+      <w:pPr>
+        <w:pStyle w:val="Legenda"/>
+        <w:jc w:val="center"/>
+        <w:rPr>
+          <w:noProof/>
+        </w:rPr>
+      </w:pPr>
+      <w:r>
+        <w:t xml:space="preserve">Figura </w:t>
+      </w:r>
+      <w:r>
+        <w:fldChar w:fldCharType="begin"/>
+      </w:r>
+      <w:r>
+        <w:instrText xml:space="preserve"> SEQ Figura \* ARABIC </w:instrText>
+      </w:r>
+      <w:r>
+        <w:fldChar w:fldCharType="separate"/>
+      </w:r>
+      <w:r>
+        <w:rPr>
+          <w:noProof/>
+        </w:rPr>
+        <w:t>6</w:t>
+      </w:r>
+      <w:r>
+        <w:fldChar w:fldCharType="end"/>
+      </w:r>
+      <w:r>
+        <w:t xml:space="preserve"> - Modulação Unipolar NRZ-I</w:t>
+      </w:r>
+      <w:r>
+        <w:rPr>
+          <w:noProof/>
+        </w:rPr>
+        <w:t xml:space="preserve"> representada via LEDs</w:t>
+      </w:r>
+      <w:r>
+        <w:rPr>
+          <w:noProof/>
+        </w:rPr>
+        <w:t xml:space="preserve"> </w:t>
+      </w:r>
+      <w:r>
+        <w:t>(Fonte: própria)</w:t>
+      </w:r>
+    </w:p>
+    <w:p/>
+    <w:p>
+      <w:pPr>
+        <w:ind w:firstLine="567"/>
+      </w:pPr>
+      <w:r>
+        <w:t>Em ambos os casos, o pulso de saída é representado pelo seu respectivo padrão fixo de LEDs acesos ou apagados, que é atualizado dinamicamente conforme se muda a configuração dos switches logo abaixo deles.</w:t>
+      </w:r>
+    </w:p>
+    <w:p>
+      <w:pPr>
+        <w:ind w:firstLine="567"/>
+      </w:pPr>
+      <w:r>
+        <w:t xml:space="preserve">Por fim, como entrega complementar, os resultados da implementação da saída modulada via PMOD conectada ao osciloscópio podem ser observadas nas figuras 7 e 8, que contém imagens dos pulsos </w:t>
+      </w:r>
+      <w:r>
+        <w:t xml:space="preserve">no software Waveforms, </w:t>
+      </w:r>
+      <w:r>
+        <w:t>sendo atualizados constantemente:</w:t>
+      </w:r>
+    </w:p>
+    <w:p>
+      <w:pPr>
+        <w:keepNext/>
+        <w:jc w:val="center"/>
+      </w:pPr>
+      <w:r>
+        <w:rPr>
+          <w:rFonts w:ascii="Arial" w:hAnsi="Arial" w:cs="Arial"/>
+          <w:noProof/>
+        </w:rPr>
+        <w:drawing>
+          <wp:inline distT="0" distB="0" distL="0" distR="0" wp14:anchorId="37DC7CA0" wp14:editId="3AF42F62">
+            <wp:extent cx="4970032" cy="2325402"/>
+            <wp:effectExtent l="0" t="0" r="2540" b="0"/>
+            <wp:docPr id="1812835614" name="Imagem 1"/>
+            <wp:cNvGraphicFramePr>
+              <a:graphicFrameLocks xmlns:a="http://schemas.openxmlformats.org/drawingml/2006/main" noChangeAspect="1"/>
+            </wp:cNvGraphicFramePr>
+            <a:graphic xmlns:a="http://schemas.openxmlformats.org/drawingml/2006/main">
+              <a:graphicData uri="http://schemas.openxmlformats.org/drawingml/2006/picture">
+                <pic:pic xmlns:pic="http://schemas.openxmlformats.org/drawingml/2006/picture">
+                  <pic:nvPicPr>
+                    <pic:cNvPr id="1812835614" name="Imagem 1"/>
+                    <pic:cNvPicPr/>
+                  </pic:nvPicPr>
+                  <pic:blipFill>
+                    <a:blip r:embed="rId11" cstate="print">
+                      <a:extLst>
+                        <a:ext uri="{28A0092B-C50C-407E-A947-70E740481C1C}">
+                          <a14:useLocalDpi xmlns:a14="http://schemas.microsoft.com/office/drawing/2010/main" val="0"/>
+                        </a:ext>
+                      </a:extLst>
+                    </a:blip>
+                    <a:stretch>
+                      <a:fillRect/>
+                    </a:stretch>
+                  </pic:blipFill>
+                  <pic:spPr>
+                    <a:xfrm>
+                      <a:off x="0" y="0"/>
+                      <a:ext cx="4970032" cy="2325402"/>
+                    </a:xfrm>
+                    <a:prstGeom prst="rect">
+                      <a:avLst/>
+                    </a:prstGeom>
+                  </pic:spPr>
+                </pic:pic>
+              </a:graphicData>
+            </a:graphic>
+          </wp:inline>
+        </w:drawing>
+      </w:r>
+    </w:p>
+    <w:p>
+      <w:pPr>
+        <w:pStyle w:val="Legenda"/>
+        <w:jc w:val="center"/>
+      </w:pPr>
+      <w:r>
+        <w:t xml:space="preserve">Figura </w:t>
+      </w:r>
+      <w:r>
+        <w:fldChar w:fldCharType="begin"/>
+      </w:r>
+      <w:r>
+        <w:instrText xml:space="preserve"> SEQ Figura \* ARABIC </w:instrText>
+      </w:r>
+      <w:r>
+        <w:fldChar w:fldCharType="separate"/>
+      </w:r>
+      <w:r>
+        <w:rPr>
+          <w:noProof/>
+        </w:rPr>
+        <w:t>7</w:t>
+      </w:r>
+      <w:r>
+        <w:fldChar w:fldCharType="end"/>
+      </w:r>
+      <w:r>
+        <w:t xml:space="preserve"> - Pulso Unipolar NRZ-L no Osciloscópio</w:t>
+      </w:r>
+      <w:r>
+        <w:t xml:space="preserve"> </w:t>
+      </w:r>
+      <w:r>
+        <w:t>(Fonte: própria)</w:t>
+      </w:r>
+    </w:p>
+    <w:p>
+      <w:pPr>
+        <w:pStyle w:val="Legenda"/>
+        <w:keepNext/>
+        <w:jc w:val="center"/>
+      </w:pPr>
+      <w:r>
+        <w:rPr>
+          <w:noProof/>
+        </w:rPr>
+        <w:lastRenderedPageBreak/>
+        <w:drawing>
+          <wp:inline distT="0" distB="0" distL="0" distR="0" wp14:anchorId="0C8001AF" wp14:editId="6D9C0C50">
+            <wp:extent cx="5119254" cy="2572269"/>
+            <wp:effectExtent l="0" t="0" r="5715" b="0"/>
+            <wp:docPr id="1544015345" name="Imagem 1"/>
+            <wp:cNvGraphicFramePr>
+              <a:graphicFrameLocks xmlns:a="http://schemas.openxmlformats.org/drawingml/2006/main" noChangeAspect="1"/>
+            </wp:cNvGraphicFramePr>
+            <a:graphic xmlns:a="http://schemas.openxmlformats.org/drawingml/2006/main">
+              <a:graphicData uri="http://schemas.openxmlformats.org/drawingml/2006/picture">
+                <pic:pic xmlns:pic="http://schemas.openxmlformats.org/drawingml/2006/picture">
+                  <pic:nvPicPr>
+                    <pic:cNvPr id="0" name="Picture 1"/>
+                    <pic:cNvPicPr>
+                      <a:picLocks noChangeAspect="1" noChangeArrowheads="1"/>
+                    </pic:cNvPicPr>
+                  </pic:nvPicPr>
+                  <pic:blipFill>
+                    <a:blip r:embed="rId12">
+                      <a:extLst>
+                        <a:ext uri="{28A0092B-C50C-407E-A947-70E740481C1C}">
+                          <a14:useLocalDpi xmlns:a14="http://schemas.microsoft.com/office/drawing/2010/main" val="0"/>
+                        </a:ext>
+                      </a:extLst>
+                    </a:blip>
+                    <a:srcRect/>
+                    <a:stretch>
+                      <a:fillRect/>
+                    </a:stretch>
+                  </pic:blipFill>
+                  <pic:spPr bwMode="auto">
+                    <a:xfrm>
+                      <a:off x="0" y="0"/>
+                      <a:ext cx="5124467" cy="2574889"/>
+                    </a:xfrm>
+                    <a:prstGeom prst="rect">
+                      <a:avLst/>
+                    </a:prstGeom>
+                    <a:noFill/>
+                    <a:ln>
+                      <a:noFill/>
+                    </a:ln>
+                  </pic:spPr>
+                </pic:pic>
+              </a:graphicData>
+            </a:graphic>
+          </wp:inline>
+        </w:drawing>
+      </w:r>
+    </w:p>
+    <w:p>
+      <w:pPr>
+        <w:pStyle w:val="Legenda"/>
+        <w:jc w:val="center"/>
+      </w:pPr>
+      <w:r>
+        <w:t xml:space="preserve">Figura </w:t>
+      </w:r>
+      <w:r>
+        <w:fldChar w:fldCharType="begin"/>
+      </w:r>
+      <w:r>
+        <w:instrText xml:space="preserve"> SEQ Figura \* ARABIC </w:instrText>
+      </w:r>
+      <w:r>
+        <w:fldChar w:fldCharType="separate"/>
+      </w:r>
+      <w:r>
+        <w:rPr>
+          <w:noProof/>
+        </w:rPr>
+        <w:t>8</w:t>
+      </w:r>
+      <w:r>
+        <w:fldChar w:fldCharType="end"/>
+      </w:r>
+      <w:r>
+        <w:t xml:space="preserve"> - </w:t>
+      </w:r>
+      <w:r>
+        <w:t>Pulso Unipolar NRZ-</w:t>
+      </w:r>
+      <w:r>
+        <w:t>I</w:t>
+      </w:r>
+      <w:r>
+        <w:t xml:space="preserve"> no Osciloscópio</w:t>
+      </w:r>
+      <w:r>
+        <w:t xml:space="preserve"> </w:t>
+      </w:r>
+      <w:r>
+        <w:t>(Fonte: própria)</w:t>
+      </w:r>
+    </w:p>
+    <w:p/>
+    <w:p>
+      <w:pPr>
+        <w:rPr>
+          <w:rFonts w:ascii="Arial" w:hAnsi="Arial" w:cs="Arial"/>
+          <w:b/>
+          <w:bCs/>
+          <w:sz w:val="28"/>
+          <w:szCs w:val="28"/>
+        </w:rPr>
+      </w:pPr>
+      <w:r>
+        <w:rPr>
+          <w:rFonts w:ascii="Arial" w:hAnsi="Arial" w:cs="Arial"/>
+          <w:b/>
+          <w:bCs/>
+          <w:sz w:val="28"/>
+          <w:szCs w:val="28"/>
+        </w:rPr>
+        <w:t>8</w:t>
+      </w:r>
+      <w:r>
+        <w:rPr>
+          <w:rFonts w:ascii="Arial" w:hAnsi="Arial" w:cs="Arial"/>
+          <w:b/>
+          <w:bCs/>
+          <w:sz w:val="28"/>
+          <w:szCs w:val="28"/>
+        </w:rPr>
+        <w:t xml:space="preserve">) </w:t>
+      </w:r>
+      <w:r>
+        <w:rPr>
+          <w:rFonts w:ascii="Arial" w:hAnsi="Arial" w:cs="Arial"/>
+          <w:b/>
+          <w:bCs/>
+          <w:sz w:val="28"/>
+          <w:szCs w:val="28"/>
+        </w:rPr>
+        <w:t>ANÁLISE E DISCUSSÃO</w:t>
+      </w:r>
+    </w:p>
+    <w:p>
+      <w:pPr>
+        <w:ind w:firstLine="567"/>
+        <w:jc w:val="both"/>
+        <w:rPr>
+          <w:rFonts w:ascii="Arial" w:hAnsi="Arial" w:cs="Arial"/>
+        </w:rPr>
+      </w:pPr>
+      <w:r>
+        <w:rPr>
+          <w:rFonts w:ascii="Arial" w:hAnsi="Arial" w:cs="Arial"/>
+        </w:rPr>
+        <w:t>A</w:t>
+      </w:r>
+      <w:r>
+        <w:rPr>
+          <w:rFonts w:ascii="Arial" w:hAnsi="Arial" w:cs="Arial"/>
+        </w:rPr>
+        <w:t>s</w:t>
+      </w:r>
+      <w:r>
+        <w:rPr>
+          <w:rFonts w:ascii="Arial" w:hAnsi="Arial" w:cs="Arial"/>
+        </w:rPr>
+        <w:t xml:space="preserve"> modulaç</w:t>
+      </w:r>
+      <w:r>
+        <w:rPr>
+          <w:rFonts w:ascii="Arial" w:hAnsi="Arial" w:cs="Arial"/>
+        </w:rPr>
+        <w:t>ões</w:t>
+      </w:r>
+      <w:r>
+        <w:rPr>
+          <w:rFonts w:ascii="Arial" w:hAnsi="Arial" w:cs="Arial"/>
+        </w:rPr>
+        <w:t xml:space="preserve"> </w:t>
+      </w:r>
+      <w:r>
+        <w:rPr>
+          <w:rFonts w:ascii="Arial" w:hAnsi="Arial" w:cs="Arial"/>
+        </w:rPr>
+        <w:t xml:space="preserve">Unipolares </w:t>
+      </w:r>
+      <w:r>
+        <w:rPr>
+          <w:rFonts w:ascii="Arial" w:hAnsi="Arial" w:cs="Arial"/>
+        </w:rPr>
+        <w:t xml:space="preserve">NRZ-L e a NRZ-I </w:t>
+      </w:r>
+      <w:r>
+        <w:rPr>
+          <w:rFonts w:ascii="Arial" w:hAnsi="Arial" w:cs="Arial"/>
+        </w:rPr>
+        <w:t>possuem algumas diferenças quanto a forma de representar o sinal modulado, que puderam ser enxergadas com maior clareza por meio dos experimentos realizados.</w:t>
+      </w:r>
+    </w:p>
+    <w:p>
+      <w:pPr>
+        <w:ind w:firstLine="567"/>
+        <w:jc w:val="both"/>
+        <w:rPr>
+          <w:rFonts w:ascii="Arial" w:hAnsi="Arial" w:cs="Arial"/>
+        </w:rPr>
+      </w:pPr>
+      <w:r>
+        <w:rPr>
+          <w:rFonts w:ascii="Arial" w:hAnsi="Arial" w:cs="Arial"/>
+        </w:rPr>
+        <w:t xml:space="preserve">No NRZ-L, cada nível lógico é representado diretamente no </w:t>
+      </w:r>
+      <w:r>
+        <w:rPr>
+          <w:rFonts w:ascii="Arial" w:hAnsi="Arial" w:cs="Arial"/>
+        </w:rPr>
+        <w:t xml:space="preserve">nível do </w:t>
+      </w:r>
+      <w:r>
+        <w:rPr>
+          <w:rFonts w:ascii="Arial" w:hAnsi="Arial" w:cs="Arial"/>
+        </w:rPr>
+        <w:t xml:space="preserve">sinal: bits “1” </w:t>
+      </w:r>
+      <w:r>
+        <w:rPr>
+          <w:rFonts w:ascii="Arial" w:hAnsi="Arial" w:cs="Arial"/>
+        </w:rPr>
+        <w:t>deixam</w:t>
+      </w:r>
+      <w:r>
+        <w:rPr>
+          <w:rFonts w:ascii="Arial" w:hAnsi="Arial" w:cs="Arial"/>
+        </w:rPr>
+        <w:t xml:space="preserve"> o nível alto e bits “0” o nível baixo. </w:t>
+      </w:r>
+      <w:r>
+        <w:rPr>
+          <w:rFonts w:ascii="Arial" w:hAnsi="Arial" w:cs="Arial"/>
+        </w:rPr>
+        <w:t>Quanto ao</w:t>
+      </w:r>
+      <w:r>
+        <w:rPr>
+          <w:rFonts w:ascii="Arial" w:hAnsi="Arial" w:cs="Arial"/>
+        </w:rPr>
+        <w:t xml:space="preserve"> NRZ-I, o sinal muda de nível sempre que o bit transmitido é “1”, </w:t>
+      </w:r>
+      <w:r>
+        <w:rPr>
+          <w:rFonts w:ascii="Arial" w:hAnsi="Arial" w:cs="Arial"/>
+        </w:rPr>
+        <w:t>e mantém o seu estado anterior quando</w:t>
+      </w:r>
+      <w:r>
+        <w:rPr>
+          <w:rFonts w:ascii="Arial" w:hAnsi="Arial" w:cs="Arial"/>
+        </w:rPr>
+        <w:t xml:space="preserve"> os bits</w:t>
+      </w:r>
+      <w:r>
+        <w:rPr>
+          <w:rFonts w:ascii="Arial" w:hAnsi="Arial" w:cs="Arial"/>
+        </w:rPr>
+        <w:t xml:space="preserve"> são</w:t>
+      </w:r>
+      <w:r>
+        <w:rPr>
+          <w:rFonts w:ascii="Arial" w:hAnsi="Arial" w:cs="Arial"/>
+        </w:rPr>
+        <w:t xml:space="preserve"> “0”</w:t>
+      </w:r>
+      <w:r>
+        <w:rPr>
+          <w:rFonts w:ascii="Arial" w:hAnsi="Arial" w:cs="Arial"/>
+        </w:rPr>
+        <w:t>.</w:t>
+      </w:r>
+      <w:r>
+        <w:rPr>
+          <w:rFonts w:ascii="Arial" w:hAnsi="Arial" w:cs="Arial"/>
+        </w:rPr>
+        <w:t xml:space="preserve"> </w:t>
+      </w:r>
+      <w:r>
+        <w:rPr>
+          <w:rFonts w:ascii="Arial" w:hAnsi="Arial" w:cs="Arial"/>
+        </w:rPr>
+        <w:t xml:space="preserve">Por conta disso, foi </w:t>
+      </w:r>
+      <w:r>
+        <w:rPr>
+          <w:rFonts w:ascii="Arial" w:hAnsi="Arial" w:cs="Arial"/>
+        </w:rPr>
+        <w:t>notada uma maior simplicidade do NRZ-L</w:t>
+      </w:r>
+      <w:r>
+        <w:rPr>
+          <w:rFonts w:ascii="Arial" w:hAnsi="Arial" w:cs="Arial"/>
+        </w:rPr>
+        <w:t xml:space="preserve"> durante a implementação </w:t>
+      </w:r>
+      <w:r>
+        <w:rPr>
+          <w:rFonts w:ascii="Arial" w:hAnsi="Arial" w:cs="Arial"/>
+        </w:rPr>
+        <w:t>dos circuitos, assim como na visualização do pulso resultante.</w:t>
+      </w:r>
+    </w:p>
+    <w:p>
+      <w:pPr>
+        <w:ind w:firstLine="567"/>
+        <w:jc w:val="both"/>
+        <w:rPr>
+          <w:rFonts w:ascii="Arial" w:hAnsi="Arial" w:cs="Arial"/>
+        </w:rPr>
+      </w:pPr>
+      <w:r>
+        <w:rPr>
+          <w:rFonts w:ascii="Arial" w:hAnsi="Arial" w:cs="Arial"/>
+        </w:rPr>
+        <w:t xml:space="preserve">Comparando a </w:t>
+      </w:r>
+      <w:r>
+        <w:rPr>
+          <w:rFonts w:ascii="Arial" w:hAnsi="Arial" w:cs="Arial"/>
+        </w:rPr>
+        <w:t xml:space="preserve">simulação realizada </w:t>
+      </w:r>
+      <w:r>
+        <w:rPr>
+          <w:rFonts w:ascii="Arial" w:hAnsi="Arial" w:cs="Arial"/>
+        </w:rPr>
+        <w:t xml:space="preserve">apenas no testbench do </w:t>
+      </w:r>
+      <w:r>
+        <w:rPr>
+          <w:rFonts w:ascii="Arial" w:hAnsi="Arial" w:cs="Arial"/>
+        </w:rPr>
+        <w:t xml:space="preserve">Vivado e os testes </w:t>
+      </w:r>
+      <w:r>
+        <w:rPr>
+          <w:rFonts w:ascii="Arial" w:hAnsi="Arial" w:cs="Arial"/>
+        </w:rPr>
+        <w:t>com a</w:t>
+      </w:r>
+      <w:r>
+        <w:rPr>
+          <w:rFonts w:ascii="Arial" w:hAnsi="Arial" w:cs="Arial"/>
+        </w:rPr>
+        <w:t xml:space="preserve"> placa FPGA, os resultados observados foram compatíveis</w:t>
+      </w:r>
+      <w:r>
+        <w:rPr>
+          <w:rFonts w:ascii="Arial" w:hAnsi="Arial" w:cs="Arial"/>
+        </w:rPr>
+        <w:t>, considerando as características dos dois casos</w:t>
+      </w:r>
+      <w:r>
+        <w:rPr>
+          <w:rFonts w:ascii="Arial" w:hAnsi="Arial" w:cs="Arial"/>
+        </w:rPr>
+        <w:t>. Durante a simulação, foi possível visualizar o comportamento dos pulsos no Waveform, confirmando que o circuito seguia</w:t>
+      </w:r>
+      <w:r>
+        <w:rPr>
+          <w:rFonts w:ascii="Arial" w:hAnsi="Arial" w:cs="Arial"/>
+        </w:rPr>
+        <w:t>,</w:t>
+      </w:r>
+      <w:r>
+        <w:rPr>
+          <w:rFonts w:ascii="Arial" w:hAnsi="Arial" w:cs="Arial"/>
+        </w:rPr>
+        <w:t xml:space="preserve"> </w:t>
+      </w:r>
+      <w:r>
+        <w:rPr>
+          <w:rFonts w:ascii="Arial" w:hAnsi="Arial" w:cs="Arial"/>
+        </w:rPr>
+        <w:t>conforme previsto,</w:t>
+      </w:r>
+      <w:r>
+        <w:rPr>
+          <w:rFonts w:ascii="Arial" w:hAnsi="Arial" w:cs="Arial"/>
+        </w:rPr>
+        <w:t xml:space="preserve"> a lógica de cada técnica de modulação. Na placa, os LEDs reproduziram o mesmo padrão esperado, permitindo verificar visualmente a transmissão dos bits</w:t>
+      </w:r>
+      <w:r>
+        <w:rPr>
+          <w:rFonts w:ascii="Arial" w:hAnsi="Arial" w:cs="Arial"/>
+        </w:rPr>
+        <w:t>.</w:t>
+      </w:r>
+    </w:p>
+    <w:p>
+      <w:pPr>
+        <w:jc w:val="both"/>
+        <w:rPr>
+          <w:rFonts w:ascii="Arial" w:hAnsi="Arial" w:cs="Arial"/>
+        </w:rPr>
+      </w:pPr>
+    </w:p>
+    <w:p>
+      <w:pPr>
+        <w:rPr>
+          <w:rFonts w:ascii="Arial" w:hAnsi="Arial" w:cs="Arial"/>
+          <w:b/>
+          <w:bCs/>
+          <w:sz w:val="28"/>
+          <w:szCs w:val="28"/>
+        </w:rPr>
+      </w:pPr>
+      <w:r>
+        <w:rPr>
+          <w:rFonts w:ascii="Arial" w:hAnsi="Arial" w:cs="Arial"/>
+          <w:b/>
+          <w:bCs/>
+          <w:sz w:val="28"/>
+          <w:szCs w:val="28"/>
+        </w:rPr>
+        <w:t>9</w:t>
+      </w:r>
+      <w:r>
+        <w:rPr>
+          <w:rFonts w:ascii="Arial" w:hAnsi="Arial" w:cs="Arial"/>
+          <w:b/>
+          <w:bCs/>
+          <w:sz w:val="28"/>
+          <w:szCs w:val="28"/>
+        </w:rPr>
+        <w:t xml:space="preserve">) </w:t>
+      </w:r>
+      <w:r>
+        <w:rPr>
+          <w:rFonts w:ascii="Arial" w:hAnsi="Arial" w:cs="Arial"/>
+          <w:b/>
+          <w:bCs/>
+          <w:sz w:val="28"/>
+          <w:szCs w:val="28"/>
+        </w:rPr>
+        <w:t>CONCLUSÕES</w:t>
+      </w:r>
+    </w:p>
+    <w:p>
+      <w:pPr>
+        <w:ind w:firstLine="567"/>
+        <w:jc w:val="both"/>
+        <w:rPr>
+          <w:rFonts w:ascii="Arial" w:hAnsi="Arial" w:cs="Arial"/>
+        </w:rPr>
+      </w:pPr>
+      <w:r>
+        <w:rPr>
+          <w:rFonts w:ascii="Arial" w:hAnsi="Arial" w:cs="Arial"/>
+        </w:rPr>
+        <w:t>Dentre os pontos de melhoria no desenvolvimento deste trabalho, poderia ser realizada a implementação de mais uma forma de visualizar a dinâmica das modulações: a integração do circuito FPGA por meio da interface VGA, por meio da qual o pulso poderia ser visualizado em monitores</w:t>
+      </w:r>
+      <w:r>
+        <w:rPr>
+          <w:rFonts w:ascii="Arial" w:hAnsi="Arial" w:cs="Arial"/>
+        </w:rPr>
+        <w:t>.</w:t>
+      </w:r>
+    </w:p>
+    <w:p>
+      <w:pPr>
+        <w:ind w:firstLine="567"/>
+        <w:jc w:val="both"/>
+        <w:rPr>
+          <w:rFonts w:ascii="Arial" w:hAnsi="Arial" w:cs="Arial"/>
+        </w:rPr>
+      </w:pPr>
+      <w:r>
+        <w:rPr>
+          <w:rFonts w:ascii="Arial" w:hAnsi="Arial" w:cs="Arial"/>
+        </w:rPr>
+        <w:lastRenderedPageBreak/>
+        <w:t>De qualquer forma, a</w:t>
+      </w:r>
+      <w:r>
+        <w:rPr>
+          <w:rFonts w:ascii="Arial" w:hAnsi="Arial" w:cs="Arial"/>
+        </w:rPr>
+        <w:t>nalisando os resultados,</w:t>
+      </w:r>
+      <w:r>
+        <w:rPr>
+          <w:rFonts w:ascii="Arial" w:hAnsi="Arial" w:cs="Arial"/>
+        </w:rPr>
+        <w:t xml:space="preserve"> </w:t>
+      </w:r>
+      <w:r>
+        <w:rPr>
+          <w:rFonts w:ascii="Arial" w:hAnsi="Arial" w:cs="Arial"/>
+        </w:rPr>
+        <w:t xml:space="preserve">entende-se </w:t>
+      </w:r>
+      <w:r>
+        <w:rPr>
+          <w:rFonts w:ascii="Arial" w:hAnsi="Arial" w:cs="Arial"/>
+        </w:rPr>
+        <w:t>que ambos os moduladores foram implementados corretamente</w:t>
+      </w:r>
+      <w:r>
+        <w:rPr>
+          <w:rFonts w:ascii="Arial" w:hAnsi="Arial" w:cs="Arial"/>
+        </w:rPr>
+        <w:t xml:space="preserve"> levando em conta o escopo discutido anteriormente</w:t>
+      </w:r>
+      <w:r>
+        <w:rPr>
+          <w:rFonts w:ascii="Arial" w:hAnsi="Arial" w:cs="Arial"/>
+        </w:rPr>
+        <w:t>, atendendo ao comportamento esperado</w:t>
+      </w:r>
+      <w:r>
+        <w:rPr>
+          <w:rFonts w:ascii="Arial" w:hAnsi="Arial" w:cs="Arial"/>
+        </w:rPr>
+        <w:t xml:space="preserve">. </w:t>
+      </w:r>
+      <w:r>
+        <w:rPr>
+          <w:rFonts w:ascii="Arial" w:hAnsi="Arial" w:cs="Arial"/>
+        </w:rPr>
+        <w:t>Por conta</w:t>
+      </w:r>
+      <w:r>
+        <w:rPr>
+          <w:rFonts w:ascii="Arial" w:hAnsi="Arial" w:cs="Arial"/>
+        </w:rPr>
+        <w:t xml:space="preserve"> do sucesso destes experimentos, foi possível compreender, teórica e praticamente, o funcionamento das duas técnicas de modulação unipolar estudadas na disciplina de Comunicação de dados, com o auxílio da matéria de Sistemas Reconfiguráveis.</w:t>
+      </w:r>
+    </w:p>
+    <w:p>
+      <w:pPr>
+        <w:ind w:firstLine="567"/>
+        <w:jc w:val="both"/>
+        <w:rPr>
+          <w:rFonts w:ascii="Arial" w:hAnsi="Arial" w:cs="Arial"/>
+        </w:rPr>
+      </w:pPr>
+    </w:p>
+    <w:p>
+      <w:pPr>
+        <w:ind w:firstLine="567"/>
+        <w:jc w:val="both"/>
+        <w:rPr>
+          <w:rFonts w:ascii="Arial" w:hAnsi="Arial" w:cs="Arial"/>
+        </w:rPr>
+      </w:pPr>
+    </w:p>
+    <w:p>
+      <w:pPr>
+        <w:ind w:firstLine="567"/>
+        <w:jc w:val="both"/>
+        <w:rPr>
+          <w:rFonts w:ascii="Arial" w:hAnsi="Arial" w:cs="Arial"/>
+        </w:rPr>
+      </w:pPr>
+    </w:p>
+    <w:p>
+      <w:pPr>
+        <w:ind w:firstLine="567"/>
+        <w:jc w:val="both"/>
+        <w:rPr>
+          <w:rFonts w:ascii="Arial" w:hAnsi="Arial" w:cs="Arial"/>
+        </w:rPr>
+      </w:pPr>
+    </w:p>
+    <w:p>
+      <w:pPr>
+        <w:ind w:firstLine="567"/>
+        <w:jc w:val="both"/>
+        <w:rPr>
+          <w:rFonts w:ascii="Arial" w:hAnsi="Arial" w:cs="Arial"/>
+        </w:rPr>
+      </w:pPr>
+    </w:p>
+    <w:p>
+      <w:pPr>
+        <w:ind w:firstLine="567"/>
+        <w:jc w:val="both"/>
+        <w:rPr>
+          <w:rFonts w:ascii="Arial" w:hAnsi="Arial" w:cs="Arial"/>
+        </w:rPr>
+      </w:pPr>
+    </w:p>
+    <w:p>
+      <w:pPr>
+        <w:ind w:firstLine="567"/>
+        <w:jc w:val="both"/>
+        <w:rPr>
+          <w:rFonts w:ascii="Arial" w:hAnsi="Arial" w:cs="Arial"/>
+        </w:rPr>
+      </w:pPr>
+    </w:p>
+    <w:p>
+      <w:pPr>
+        <w:ind w:firstLine="567"/>
+        <w:jc w:val="both"/>
+        <w:rPr>
+          <w:rFonts w:ascii="Arial" w:hAnsi="Arial" w:cs="Arial"/>
+        </w:rPr>
+      </w:pPr>
+    </w:p>
+    <w:p>
+      <w:pPr>
+        <w:ind w:firstLine="567"/>
+        <w:jc w:val="both"/>
+        <w:rPr>
+          <w:rFonts w:ascii="Arial" w:hAnsi="Arial" w:cs="Arial"/>
+        </w:rPr>
+      </w:pPr>
+    </w:p>
+    <w:p>
+      <w:pPr>
+        <w:ind w:firstLine="567"/>
+        <w:jc w:val="both"/>
+        <w:rPr>
+          <w:rFonts w:ascii="Arial" w:hAnsi="Arial" w:cs="Arial"/>
+        </w:rPr>
+      </w:pPr>
+    </w:p>
+    <w:p>
+      <w:pPr>
+        <w:ind w:firstLine="567"/>
+        <w:jc w:val="both"/>
+        <w:rPr>
+          <w:rFonts w:ascii="Arial" w:hAnsi="Arial" w:cs="Arial"/>
+        </w:rPr>
+      </w:pPr>
+    </w:p>
+    <w:p>
+      <w:pPr>
+        <w:ind w:firstLine="567"/>
+        <w:jc w:val="both"/>
+        <w:rPr>
+          <w:rFonts w:ascii="Arial" w:hAnsi="Arial" w:cs="Arial"/>
+        </w:rPr>
+      </w:pPr>
+    </w:p>
+    <w:p>
+      <w:pPr>
+        <w:ind w:firstLine="567"/>
+        <w:jc w:val="both"/>
+        <w:rPr>
+          <w:rFonts w:ascii="Arial" w:hAnsi="Arial" w:cs="Arial"/>
+        </w:rPr>
+      </w:pPr>
+    </w:p>
+    <w:p>
+      <w:pPr>
+        <w:ind w:firstLine="567"/>
+        <w:jc w:val="both"/>
+        <w:rPr>
+          <w:rFonts w:ascii="Arial" w:hAnsi="Arial" w:cs="Arial"/>
+        </w:rPr>
+      </w:pPr>
+    </w:p>
+    <w:p>
+      <w:pPr>
+        <w:ind w:firstLine="567"/>
+        <w:jc w:val="both"/>
+        <w:rPr>
+          <w:rFonts w:ascii="Arial" w:hAnsi="Arial" w:cs="Arial"/>
+        </w:rPr>
+      </w:pPr>
+    </w:p>
+    <w:p>
+      <w:pPr>
+        <w:ind w:firstLine="567"/>
+        <w:jc w:val="both"/>
+        <w:rPr>
+          <w:rFonts w:ascii="Arial" w:hAnsi="Arial" w:cs="Arial"/>
+        </w:rPr>
+      </w:pPr>
+    </w:p>
+    <w:p>
+      <w:pPr>
+        <w:ind w:firstLine="567"/>
+        <w:jc w:val="both"/>
+        <w:rPr>
+          <w:rFonts w:ascii="Arial" w:hAnsi="Arial" w:cs="Arial"/>
+        </w:rPr>
+      </w:pPr>
+    </w:p>
+    <w:p>
+      <w:pPr>
+        <w:ind w:firstLine="567"/>
+        <w:jc w:val="both"/>
+        <w:rPr>
+          <w:rFonts w:ascii="Arial" w:hAnsi="Arial" w:cs="Arial"/>
+        </w:rPr>
+      </w:pPr>
+    </w:p>
+    <w:p>
+      <w:pPr>
+        <w:ind w:firstLine="567"/>
+        <w:jc w:val="both"/>
+        <w:rPr>
+          <w:rFonts w:ascii="Arial" w:hAnsi="Arial" w:cs="Arial"/>
+        </w:rPr>
+      </w:pPr>
+    </w:p>
+    <w:p>
+      <w:pPr>
+        <w:ind w:firstLine="567"/>
+        <w:jc w:val="both"/>
+        <w:rPr>
+          <w:rFonts w:ascii="Arial" w:hAnsi="Arial" w:cs="Arial"/>
+        </w:rPr>
+      </w:pPr>
+    </w:p>
+    <w:p>
+      <w:pPr>
+        <w:ind w:firstLine="567"/>
+        <w:jc w:val="both"/>
+        <w:rPr>
+          <w:rFonts w:ascii="Arial" w:hAnsi="Arial" w:cs="Arial"/>
+        </w:rPr>
+      </w:pPr>
+    </w:p>
+    <w:p>
+      <w:pPr>
+        <w:ind w:firstLine="567"/>
+        <w:jc w:val="both"/>
+        <w:rPr>
+          <w:rFonts w:ascii="Arial" w:hAnsi="Arial" w:cs="Arial"/>
+        </w:rPr>
+      </w:pPr>
+    </w:p>
+    <w:p>
+      <w:pPr>
+        <w:ind w:firstLine="567"/>
+        <w:jc w:val="both"/>
+        <w:rPr>
+          <w:rFonts w:ascii="Arial" w:hAnsi="Arial" w:cs="Arial"/>
+        </w:rPr>
+      </w:pPr>
+    </w:p>
+    <w:p>
+      <w:pPr>
+        <w:rPr>
+          <w:rFonts w:ascii="Arial" w:hAnsi="Arial" w:cs="Arial"/>
+          <w:b/>
+          <w:bCs/>
+          <w:sz w:val="28"/>
+          <w:szCs w:val="28"/>
+        </w:rPr>
+      </w:pPr>
+      <w:r>
+        <w:rPr>
+          <w:rFonts w:ascii="Arial" w:hAnsi="Arial" w:cs="Arial"/>
+          <w:b/>
+          <w:bCs/>
+          <w:sz w:val="28"/>
+          <w:szCs w:val="28"/>
+        </w:rPr>
+        <w:t>REFERÊNCIAS BIBLIOGRÁFICAS</w:t>
+      </w:r>
+    </w:p>
+    <w:p>
+      <w:pPr>
+        <w:ind w:firstLine="567"/>
+        <w:jc w:val="both"/>
+        <w:rPr>
+          <w:rFonts w:ascii="Arial" w:hAnsi="Arial" w:cs="Arial"/>
+        </w:rPr>
+      </w:pPr>
+    </w:p>
+    <w:p>
+      <w:pPr>
+        <w:ind w:firstLine="567"/>
+        <w:jc w:val="both"/>
+        <w:rPr>
+          <w:rFonts w:ascii="Arial" w:hAnsi="Arial" w:cs="Arial"/>
+        </w:rPr>
+      </w:pPr>
+      <w:r>
+        <w:rPr>
+          <w:rFonts w:ascii="Arial" w:hAnsi="Arial" w:cs="Arial"/>
+        </w:rPr>
+        <w:t xml:space="preserve">DIGILENT. </w:t>
+      </w:r>
+      <w:r>
+        <w:rPr>
+          <w:rFonts w:ascii="Arial" w:hAnsi="Arial" w:cs="Arial"/>
+          <w:b/>
+          <w:bCs/>
+        </w:rPr>
+        <w:t>Analog Discovery 3 datasheet.</w:t>
+      </w:r>
+      <w:r>
+        <w:rPr>
+          <w:rFonts w:ascii="Arial" w:hAnsi="Arial" w:cs="Arial"/>
+        </w:rPr>
+        <w:t xml:space="preserve"> Disponível em: https://files.digilent.com/datasheets/Analog-Discovery-3-Datasheet.pdf. Acesso em: 26 maio 2026.</w:t>
+      </w:r>
+    </w:p>
+    <w:p>
+      <w:pPr>
+        <w:ind w:firstLine="567"/>
+        <w:jc w:val="both"/>
+        <w:rPr>
+          <w:rFonts w:ascii="Arial" w:hAnsi="Arial" w:cs="Arial"/>
+        </w:rPr>
+      </w:pPr>
+    </w:p>
+    <w:p>
+      <w:pPr>
+        <w:ind w:firstLine="567"/>
+        <w:jc w:val="both"/>
+        <w:rPr>
+          <w:rFonts w:ascii="Arial" w:hAnsi="Arial" w:cs="Arial"/>
+        </w:rPr>
+      </w:pPr>
+      <w:r>
+        <w:rPr>
+          <w:rFonts w:ascii="Arial" w:hAnsi="Arial" w:cs="Arial"/>
+        </w:rPr>
+        <w:t xml:space="preserve">DIGILENT. </w:t>
+      </w:r>
+      <w:r>
+        <w:rPr>
+          <w:rFonts w:ascii="Arial" w:hAnsi="Arial" w:cs="Arial"/>
+          <w:b/>
+          <w:bCs/>
+        </w:rPr>
+        <w:t>Basys 3™ FPGA Board Reference Manual.</w:t>
+      </w:r>
+      <w:r>
+        <w:rPr>
+          <w:rFonts w:ascii="Arial" w:hAnsi="Arial" w:cs="Arial"/>
+        </w:rPr>
+        <w:t xml:space="preserve"> Disponível em: https://digilent.com/reference/_media/basys3:%20basys3_rm.pdf?srsltid=AfmBOoq-OC1U6n6aU09AZ2CRy4-4goUCeAv7D948SjCyFCZnExoys02Z. Acesso em: 26 maio 2026.</w:t>
+      </w:r>
+    </w:p>
+    <w:p>
+      <w:pPr>
+        <w:ind w:firstLine="567"/>
+        <w:jc w:val="both"/>
+        <w:rPr>
+          <w:rFonts w:ascii="Arial" w:hAnsi="Arial" w:cs="Arial"/>
+        </w:rPr>
+      </w:pPr>
+    </w:p>
+    <w:p>
+      <w:pPr>
+        <w:ind w:firstLine="567"/>
+        <w:jc w:val="both"/>
+        <w:rPr>
+          <w:rFonts w:ascii="Arial" w:hAnsi="Arial" w:cs="Arial"/>
+        </w:rPr>
+      </w:pPr>
+      <w:r>
+        <w:rPr>
+          <w:rFonts w:ascii="Arial" w:hAnsi="Arial" w:cs="Arial"/>
+        </w:rPr>
+        <w:t xml:space="preserve">FOROUZAN, B. A. </w:t>
+      </w:r>
+      <w:r>
+        <w:rPr>
+          <w:rFonts w:ascii="Arial" w:hAnsi="Arial" w:cs="Arial"/>
+          <w:b/>
+          <w:bCs/>
+        </w:rPr>
+        <w:t>Comunicação de dados e redes de computadores</w:t>
+      </w:r>
+      <w:r>
+        <w:rPr>
+          <w:rFonts w:ascii="Arial" w:hAnsi="Arial" w:cs="Arial"/>
+        </w:rPr>
+        <w:t>. São Paulo: McGraw-Hill Brasil, 2008.</w:t>
+      </w:r>
+    </w:p>
+    <w:p>
+      <w:pPr>
+        <w:ind w:firstLine="567"/>
+        <w:jc w:val="both"/>
+        <w:rPr>
+          <w:rFonts w:ascii="Arial" w:hAnsi="Arial" w:cs="Arial"/>
+        </w:rPr>
+      </w:pPr>
+    </w:p>
+    <w:p>
+      <w:pPr>
+        <w:ind w:firstLine="567"/>
+        <w:jc w:val="both"/>
+        <w:rPr>
+          <w:rFonts w:ascii="Arial" w:hAnsi="Arial" w:cs="Arial"/>
+        </w:rPr>
+      </w:pPr>
+      <w:r>
+        <w:rPr>
+          <w:rFonts w:ascii="Arial" w:hAnsi="Arial" w:cs="Arial"/>
+        </w:rPr>
+        <w:t xml:space="preserve">GEEKS FOR GEEKS. </w:t>
+      </w:r>
+      <w:r>
+        <w:rPr>
+          <w:rFonts w:ascii="Arial" w:hAnsi="Arial" w:cs="Arial"/>
+          <w:b/>
+          <w:bCs/>
+        </w:rPr>
+        <w:t>Difference between Unipolar, Polar and Bipolar Line Coding Schemes.</w:t>
+      </w:r>
+      <w:r>
+        <w:rPr>
+          <w:rFonts w:ascii="Arial" w:hAnsi="Arial" w:cs="Arial"/>
+        </w:rPr>
+        <w:t xml:space="preserve"> Disponível em: https://www.geeksforgeeks.org/digital-logic/difference-between-unipolar-polar-and-bipolar-line-coding-schemes/. Acesso em: 26 maio 2026.</w:t>
+      </w:r>
+    </w:p>
+    <w:p>
+      <w:pPr>
+        <w:ind w:firstLine="567"/>
+        <w:jc w:val="both"/>
+        <w:rPr>
+          <w:rFonts w:ascii="Arial" w:hAnsi="Arial" w:cs="Arial"/>
+        </w:rPr>
+      </w:pPr>
+    </w:p>
+    <w:p>
+      <w:pPr>
+        <w:ind w:firstLine="567"/>
+        <w:jc w:val="both"/>
+        <w:rPr>
+          <w:rFonts w:ascii="Arial" w:hAnsi="Arial" w:cs="Arial"/>
+        </w:rPr>
+      </w:pPr>
+      <w:r>
+        <w:rPr>
+          <w:rFonts w:ascii="Arial" w:hAnsi="Arial" w:cs="Arial"/>
+        </w:rPr>
+        <w:t xml:space="preserve">LUGLI, A. B.; SANTOS, M. M. D. </w:t>
+      </w:r>
+      <w:r>
+        <w:rPr>
+          <w:rFonts w:ascii="Arial" w:hAnsi="Arial" w:cs="Arial"/>
+          <w:b/>
+          <w:bCs/>
+        </w:rPr>
+        <w:t>Redes industriais para automação industrial: AS-I, PROFIBUS e PROFINET</w:t>
+      </w:r>
+      <w:r>
+        <w:rPr>
+          <w:rFonts w:ascii="Arial" w:hAnsi="Arial" w:cs="Arial"/>
+        </w:rPr>
+        <w:t>. São Paulo: Editora Érica, 2010.</w:t>
+      </w:r>
+    </w:p>
+    <w:p>
+      <w:pPr>
+        <w:ind w:firstLine="567"/>
+        <w:jc w:val="both"/>
+        <w:rPr>
+          <w:rFonts w:ascii="Arial" w:hAnsi="Arial" w:cs="Arial"/>
+        </w:rPr>
+      </w:pPr>
+    </w:p>
+    <w:p>
+      <w:pPr>
+        <w:ind w:firstLine="567"/>
+        <w:jc w:val="both"/>
+        <w:rPr>
+          <w:rFonts w:ascii="Arial" w:hAnsi="Arial" w:cs="Arial"/>
+        </w:rPr>
+      </w:pPr>
+      <w:r>
+        <w:rPr>
+          <w:rFonts w:ascii="Arial" w:hAnsi="Arial" w:cs="Arial"/>
+        </w:rPr>
+        <w:t xml:space="preserve">MATHIAS, Márcio Antônio; PAVÃO, Augusto Carlos. </w:t>
+      </w:r>
+      <w:r>
+        <w:rPr>
+          <w:rFonts w:ascii="Arial" w:hAnsi="Arial" w:cs="Arial"/>
+          <w:b/>
+          <w:bCs/>
+        </w:rPr>
+        <w:t>Curso de modulação digital parte 1</w:t>
+      </w:r>
+      <w:r>
+        <w:rPr>
+          <w:rFonts w:ascii="Arial" w:hAnsi="Arial" w:cs="Arial"/>
+        </w:rPr>
+        <w:t>. Disponível em: https://maua.br/files/artigos/curso-modulacao-digital-parte-1.pdf. Acesso em: 26 maio 2026.</w:t>
+      </w:r>
     </w:p>
     <w:sectPr>
       <w:pgSz w:w="11906" w:h="16838"/>
@@ -2106,6 +4040,29 @@
       <w:szCs w:val="18"/>
     </w:rPr>
   </w:style>
+  <w:style w:type="character" w:styleId="Hyperlink">
+    <w:name w:val="Hyperlink"/>
+    <w:basedOn w:val="Fontepargpadro"/>
+    <w:uiPriority w:val="99"/>
+    <w:unhideWhenUsed/>
+    <w:rsid w:val="00D141F0"/>
+    <w:rPr>
+      <w:color w:val="467886" w:themeColor="hyperlink"/>
+      <w:u w:val="single"/>
+    </w:rPr>
+  </w:style>
+  <w:style w:type="character" w:styleId="MenoPendente">
+    <w:name w:val="Unresolved Mention"/>
+    <w:basedOn w:val="Fontepargpadro"/>
+    <w:uiPriority w:val="99"/>
+    <w:semiHidden/>
+    <w:unhideWhenUsed/>
+    <w:rsid w:val="00D141F0"/>
+    <w:rPr>
+      <w:color w:val="605E5C"/>
+      <w:shd w:val="clear" w:color="auto" w:fill="E1DFDD"/>
+    </w:rPr>
+  </w:style>
 </w:styles>
 </file>
 
@@ -2402,4 +4359,16 @@
     </a:ext>
   </a:extLst>
 </a:theme>
+</file>
+
+<file path=customXml/item1.xml><?xml version="1.0" encoding="utf-8"?>
+<b:Sources xmlns:b="http://schemas.openxmlformats.org/officeDocument/2006/bibliography" xmlns="http://schemas.openxmlformats.org/officeDocument/2006/bibliography" SelectedStyle="\APASixthEditionOfficeOnline.xsl" StyleName="APA" Version="6"/>
+</file>
+
+<file path=customXml/itemProps1.xml><?xml version="1.0" encoding="utf-8"?>
+<ds:datastoreItem xmlns:ds="http://schemas.openxmlformats.org/officeDocument/2006/customXml" ds:itemID="{59F9A724-31E3-4193-AE26-3A9DCF6B6896}">
+  <ds:schemaRefs>
+    <ds:schemaRef ds:uri="http://schemas.openxmlformats.org/officeDocument/2006/bibliography"/>
+  </ds:schemaRefs>
+</ds:datastoreItem>
 </file>
</xml_diff>